<commit_message>
Updated documentation for DIFS
</commit_message>
<xml_diff>
--- a/DiffServ_0112_1730_coco2/StableDiffusion추론모듈_20260115_V1.0_GoogleTranslated.docx
+++ b/DiffServ_0112_1730_coco2/StableDiffusion추론모듈_20260115_V1.0_GoogleTranslated.docx
@@ -3586,7 +3586,7 @@
           <w:docPartGallery w:val="Table of Contents"/>
           <w:docPartUnique w:val="true"/>
         </w:docPartObj>
-        <w:id w:val="169168685"/>
+        <w:id w:val="247452431"/>
       </w:sdtPr>
       <w:sdtContent>
         <w:p>
@@ -8338,13 +8338,67 @@
       </w:pPr>
       <w:r>
         <w:rPr/>
-        <w:t xml:space="preserve">// Run docker run and run the inference module: gpu server ; </w:t>
+        <w:t xml:space="preserve">// Run docker run and run the inference module: </w:t>
+      </w:r>
+      <w:r>
+        <w:rPr>
+          <w:color w:val="2A6099"/>
+        </w:rPr>
+        <w:t>gpu server</w:t>
+      </w:r>
+      <w:r>
+        <w:rPr/>
+        <w:t xml:space="preserve"> ; </w:t>
       </w:r>
       <w:r>
         <w:rPr>
           <w:color w:val="C9211E"/>
         </w:rPr>
-        <w:t>PNB: Then run 4.2-6</w:t>
+        <w:t xml:space="preserve">PNB: Then run 4.2-6. </w:t>
+      </w:r>
+      <w:r>
+        <w:rPr>
+          <w:color w:val="C9211E"/>
+        </w:rPr>
+        <w:t>(I run this after everything was set)</w:t>
+      </w:r>
+    </w:p>
+    <w:p>
+      <w:pPr>
+        <w:pStyle w:val="Normal"/>
+        <w:rPr>
+          <w:color w:val="C9211E"/>
+        </w:rPr>
+      </w:pPr>
+      <w:r>
+        <w:rPr/>
+      </w:r>
+    </w:p>
+    <w:p>
+      <w:pPr>
+        <w:pStyle w:val="Normal"/>
+        <w:rPr>
+          <w:i/>
+          <w:i/>
+          <w:iCs/>
+          <w:color w:val="00A933"/>
+        </w:rPr>
+      </w:pPr>
+      <w:r>
+        <w:rPr>
+          <w:i/>
+          <w:iCs/>
+          <w:color w:val="00A933"/>
+        </w:rPr>
+        <w:t>O</w:t>
+      </w:r>
+      <w:r>
+        <w:rPr>
+          <w:i/>
+          <w:iCs/>
+          <w:color w:val="00A933"/>
+        </w:rPr>
+        <w:t>riginal Command by Heesik:</w:t>
       </w:r>
     </w:p>
     <w:p>
@@ -8369,11 +8423,59 @@
     <w:p>
       <w:pPr>
         <w:pStyle w:val="Normal"/>
-        <w:rPr/>
-      </w:pPr>
-      <w:r>
-        <w:rPr/>
-        <w:t xml:space="preserve">// Run the inference module by docker run: cpu (no gpu); </w:t>
+        <w:rPr>
+          <w:i/>
+          <w:i/>
+          <w:iCs/>
+          <w:color w:val="00A933"/>
+        </w:rPr>
+      </w:pPr>
+      <w:r>
+        <w:rPr>
+          <w:i/>
+          <w:iCs/>
+          <w:color w:val="00A933"/>
+        </w:rPr>
+        <w:t>Alternative that I eventually run:</w:t>
+      </w:r>
+    </w:p>
+    <w:p>
+      <w:pPr>
+        <w:pStyle w:val="Normal"/>
+        <w:rPr/>
+      </w:pPr>
+      <w:r>
+        <w:rPr/>
+        <w:t>docker run -it --gpus all   -p 50060:50060   -v /tmp/model:/tmp/model   -v /tmp/diffusion_output:/tmp/diffusion_output   pytorch-diffusion-server   -model 4   -sampler 2   -thread 10   -port 50060   -npz /tmp/model/real_stats.npz</w:t>
+      </w:r>
+    </w:p>
+    <w:p>
+      <w:pPr>
+        <w:pStyle w:val="Normal"/>
+        <w:rPr/>
+      </w:pPr>
+      <w:r>
+        <w:rPr/>
+      </w:r>
+    </w:p>
+    <w:p>
+      <w:pPr>
+        <w:pStyle w:val="Normal"/>
+        <w:rPr/>
+      </w:pPr>
+      <w:r>
+        <w:rPr/>
+        <w:t xml:space="preserve">// Run the inference module by docker run: </w:t>
+      </w:r>
+      <w:r>
+        <w:rPr>
+          <w:color w:val="2A6099"/>
+        </w:rPr>
+        <w:t>cpu (no gpu);</w:t>
+      </w:r>
+      <w:r>
+        <w:rPr/>
+        <w:t xml:space="preserve"> </w:t>
       </w:r>
       <w:r>
         <w:rPr>
@@ -8434,7 +8536,13 @@
       </w:pPr>
       <w:r>
         <w:rPr/>
-        <w:t>// Model file directory (copied in advance)</w:t>
+        <w:t xml:space="preserve">// Model file directory (copied in advance); </w:t>
+      </w:r>
+      <w:r>
+        <w:rPr>
+          <w:color w:val="00A933"/>
+        </w:rPr>
+        <w:t>This should have been done beforehand (i.e. before attempting to docker connect to server)</w:t>
       </w:r>
     </w:p>
     <w:p>
@@ -9360,7 +9468,7 @@
         <w:docPartGallery w:val="Page Numbers (Bottom of Page)"/>
         <w:docPartUnique w:val="true"/>
       </w:docPartObj>
-      <w:id w:val="1339390528"/>
+      <w:id w:val="2114525287"/>
     </w:sdtPr>
     <w:sdtContent>
       <w:p>

</xml_diff>

<commit_message>
Finished a portion of the debugging and testing work related to horizontal, vertical and hybrid autoscaling
</commit_message>
<xml_diff>
--- a/DiffServ_0112_1730_coco2/StableDiffusion추론모듈_20260115_V1.0_GoogleTranslated.docx
+++ b/DiffServ_0112_1730_coco2/StableDiffusion추론모듈_20260115_V1.0_GoogleTranslated.docx
@@ -356,8 +356,8 @@
         <w:tblLook w:val="04a0"/>
       </w:tblPr>
       <w:tblGrid>
-        <w:gridCol w:w="823"/>
-        <w:gridCol w:w="1661"/>
+        <w:gridCol w:w="822"/>
+        <w:gridCol w:w="1662"/>
         <w:gridCol w:w="5138"/>
         <w:gridCol w:w="1274"/>
       </w:tblGrid>
@@ -367,7 +367,7 @@
         </w:trPr>
         <w:tc>
           <w:tcPr>
-            <w:tcW w:w="823" w:type="dxa"/>
+            <w:tcW w:w="822" w:type="dxa"/>
             <w:tcBorders/>
             <w:shd w:color="auto" w:fill="EEECE1" w:themeFill="background2" w:val="clear"/>
             <w:vAlign w:val="center"/>
@@ -403,7 +403,7 @@
         </w:tc>
         <w:tc>
           <w:tcPr>
-            <w:tcW w:w="1661" w:type="dxa"/>
+            <w:tcW w:w="1662" w:type="dxa"/>
             <w:tcBorders/>
             <w:shd w:color="auto" w:fill="EEECE1" w:themeFill="background2" w:val="clear"/>
             <w:vAlign w:val="center"/>
@@ -516,7 +516,7 @@
         </w:trPr>
         <w:tc>
           <w:tcPr>
-            <w:tcW w:w="823" w:type="dxa"/>
+            <w:tcW w:w="822" w:type="dxa"/>
             <w:tcBorders/>
             <w:vAlign w:val="center"/>
           </w:tcPr>
@@ -546,7 +546,7 @@
         </w:tc>
         <w:tc>
           <w:tcPr>
-            <w:tcW w:w="1661" w:type="dxa"/>
+            <w:tcW w:w="1662" w:type="dxa"/>
             <w:tcBorders/>
             <w:vAlign w:val="center"/>
           </w:tcPr>
@@ -641,7 +641,7 @@
         </w:trPr>
         <w:tc>
           <w:tcPr>
-            <w:tcW w:w="823" w:type="dxa"/>
+            <w:tcW w:w="822" w:type="dxa"/>
             <w:tcBorders/>
             <w:vAlign w:val="center"/>
           </w:tcPr>
@@ -667,7 +667,7 @@
         </w:tc>
         <w:tc>
           <w:tcPr>
-            <w:tcW w:w="1661" w:type="dxa"/>
+            <w:tcW w:w="1662" w:type="dxa"/>
             <w:tcBorders/>
             <w:vAlign w:val="center"/>
           </w:tcPr>
@@ -750,7 +750,7 @@
         </w:trPr>
         <w:tc>
           <w:tcPr>
-            <w:tcW w:w="823" w:type="dxa"/>
+            <w:tcW w:w="822" w:type="dxa"/>
             <w:tcBorders/>
             <w:vAlign w:val="center"/>
           </w:tcPr>
@@ -776,7 +776,7 @@
         </w:tc>
         <w:tc>
           <w:tcPr>
-            <w:tcW w:w="1661" w:type="dxa"/>
+            <w:tcW w:w="1662" w:type="dxa"/>
             <w:tcBorders/>
             <w:vAlign w:val="center"/>
           </w:tcPr>
@@ -859,7 +859,7 @@
         </w:trPr>
         <w:tc>
           <w:tcPr>
-            <w:tcW w:w="823" w:type="dxa"/>
+            <w:tcW w:w="822" w:type="dxa"/>
             <w:tcBorders/>
             <w:vAlign w:val="center"/>
           </w:tcPr>
@@ -885,7 +885,7 @@
         </w:tc>
         <w:tc>
           <w:tcPr>
-            <w:tcW w:w="1661" w:type="dxa"/>
+            <w:tcW w:w="1662" w:type="dxa"/>
             <w:tcBorders/>
             <w:vAlign w:val="center"/>
           </w:tcPr>
@@ -968,7 +968,7 @@
         </w:trPr>
         <w:tc>
           <w:tcPr>
-            <w:tcW w:w="823" w:type="dxa"/>
+            <w:tcW w:w="822" w:type="dxa"/>
             <w:tcBorders/>
             <w:vAlign w:val="center"/>
           </w:tcPr>
@@ -994,7 +994,7 @@
         </w:tc>
         <w:tc>
           <w:tcPr>
-            <w:tcW w:w="1661" w:type="dxa"/>
+            <w:tcW w:w="1662" w:type="dxa"/>
             <w:tcBorders/>
             <w:vAlign w:val="center"/>
           </w:tcPr>
@@ -1077,7 +1077,7 @@
         </w:trPr>
         <w:tc>
           <w:tcPr>
-            <w:tcW w:w="823" w:type="dxa"/>
+            <w:tcW w:w="822" w:type="dxa"/>
             <w:tcBorders/>
             <w:vAlign w:val="center"/>
           </w:tcPr>
@@ -1103,7 +1103,7 @@
         </w:tc>
         <w:tc>
           <w:tcPr>
-            <w:tcW w:w="1661" w:type="dxa"/>
+            <w:tcW w:w="1662" w:type="dxa"/>
             <w:tcBorders/>
             <w:vAlign w:val="center"/>
           </w:tcPr>
@@ -1186,7 +1186,7 @@
         </w:trPr>
         <w:tc>
           <w:tcPr>
-            <w:tcW w:w="823" w:type="dxa"/>
+            <w:tcW w:w="822" w:type="dxa"/>
             <w:tcBorders/>
             <w:vAlign w:val="center"/>
           </w:tcPr>
@@ -1212,7 +1212,7 @@
         </w:tc>
         <w:tc>
           <w:tcPr>
-            <w:tcW w:w="1661" w:type="dxa"/>
+            <w:tcW w:w="1662" w:type="dxa"/>
             <w:tcBorders/>
             <w:vAlign w:val="center"/>
           </w:tcPr>
@@ -1295,7 +1295,7 @@
         </w:trPr>
         <w:tc>
           <w:tcPr>
-            <w:tcW w:w="823" w:type="dxa"/>
+            <w:tcW w:w="822" w:type="dxa"/>
             <w:tcBorders/>
             <w:vAlign w:val="center"/>
           </w:tcPr>
@@ -1321,7 +1321,7 @@
         </w:tc>
         <w:tc>
           <w:tcPr>
-            <w:tcW w:w="1661" w:type="dxa"/>
+            <w:tcW w:w="1662" w:type="dxa"/>
             <w:tcBorders/>
             <w:vAlign w:val="center"/>
           </w:tcPr>
@@ -1404,7 +1404,7 @@
         </w:trPr>
         <w:tc>
           <w:tcPr>
-            <w:tcW w:w="823" w:type="dxa"/>
+            <w:tcW w:w="822" w:type="dxa"/>
             <w:tcBorders/>
             <w:vAlign w:val="center"/>
           </w:tcPr>
@@ -1430,7 +1430,7 @@
         </w:tc>
         <w:tc>
           <w:tcPr>
-            <w:tcW w:w="1661" w:type="dxa"/>
+            <w:tcW w:w="1662" w:type="dxa"/>
             <w:tcBorders/>
             <w:vAlign w:val="center"/>
           </w:tcPr>
@@ -1513,7 +1513,7 @@
         </w:trPr>
         <w:tc>
           <w:tcPr>
-            <w:tcW w:w="823" w:type="dxa"/>
+            <w:tcW w:w="822" w:type="dxa"/>
             <w:tcBorders/>
             <w:vAlign w:val="center"/>
           </w:tcPr>
@@ -1539,7 +1539,7 @@
         </w:tc>
         <w:tc>
           <w:tcPr>
-            <w:tcW w:w="1661" w:type="dxa"/>
+            <w:tcW w:w="1662" w:type="dxa"/>
             <w:tcBorders/>
             <w:vAlign w:val="center"/>
           </w:tcPr>
@@ -1622,7 +1622,7 @@
         </w:trPr>
         <w:tc>
           <w:tcPr>
-            <w:tcW w:w="823" w:type="dxa"/>
+            <w:tcW w:w="822" w:type="dxa"/>
             <w:tcBorders/>
             <w:vAlign w:val="center"/>
           </w:tcPr>
@@ -1648,7 +1648,7 @@
         </w:tc>
         <w:tc>
           <w:tcPr>
-            <w:tcW w:w="1661" w:type="dxa"/>
+            <w:tcW w:w="1662" w:type="dxa"/>
             <w:tcBorders/>
             <w:vAlign w:val="center"/>
           </w:tcPr>
@@ -1731,7 +1731,7 @@
         </w:trPr>
         <w:tc>
           <w:tcPr>
-            <w:tcW w:w="823" w:type="dxa"/>
+            <w:tcW w:w="822" w:type="dxa"/>
             <w:tcBorders/>
             <w:vAlign w:val="center"/>
           </w:tcPr>
@@ -1757,7 +1757,7 @@
         </w:tc>
         <w:tc>
           <w:tcPr>
-            <w:tcW w:w="1661" w:type="dxa"/>
+            <w:tcW w:w="1662" w:type="dxa"/>
             <w:tcBorders/>
             <w:vAlign w:val="center"/>
           </w:tcPr>
@@ -1840,7 +1840,7 @@
         </w:trPr>
         <w:tc>
           <w:tcPr>
-            <w:tcW w:w="823" w:type="dxa"/>
+            <w:tcW w:w="822" w:type="dxa"/>
             <w:tcBorders/>
             <w:vAlign w:val="center"/>
           </w:tcPr>
@@ -1866,7 +1866,7 @@
         </w:tc>
         <w:tc>
           <w:tcPr>
-            <w:tcW w:w="1661" w:type="dxa"/>
+            <w:tcW w:w="1662" w:type="dxa"/>
             <w:tcBorders/>
             <w:vAlign w:val="center"/>
           </w:tcPr>
@@ -1949,7 +1949,7 @@
         </w:trPr>
         <w:tc>
           <w:tcPr>
-            <w:tcW w:w="823" w:type="dxa"/>
+            <w:tcW w:w="822" w:type="dxa"/>
             <w:tcBorders/>
             <w:vAlign w:val="center"/>
           </w:tcPr>
@@ -1975,7 +1975,7 @@
         </w:tc>
         <w:tc>
           <w:tcPr>
-            <w:tcW w:w="1661" w:type="dxa"/>
+            <w:tcW w:w="1662" w:type="dxa"/>
             <w:tcBorders/>
             <w:vAlign w:val="center"/>
           </w:tcPr>
@@ -2058,7 +2058,7 @@
         </w:trPr>
         <w:tc>
           <w:tcPr>
-            <w:tcW w:w="823" w:type="dxa"/>
+            <w:tcW w:w="822" w:type="dxa"/>
             <w:tcBorders/>
             <w:vAlign w:val="center"/>
           </w:tcPr>
@@ -2084,7 +2084,7 @@
         </w:tc>
         <w:tc>
           <w:tcPr>
-            <w:tcW w:w="1661" w:type="dxa"/>
+            <w:tcW w:w="1662" w:type="dxa"/>
             <w:tcBorders/>
             <w:vAlign w:val="center"/>
           </w:tcPr>
@@ -2167,7 +2167,7 @@
         </w:trPr>
         <w:tc>
           <w:tcPr>
-            <w:tcW w:w="823" w:type="dxa"/>
+            <w:tcW w:w="822" w:type="dxa"/>
             <w:tcBorders/>
             <w:vAlign w:val="center"/>
           </w:tcPr>
@@ -2193,7 +2193,7 @@
         </w:tc>
         <w:tc>
           <w:tcPr>
-            <w:tcW w:w="1661" w:type="dxa"/>
+            <w:tcW w:w="1662" w:type="dxa"/>
             <w:tcBorders/>
             <w:vAlign w:val="center"/>
           </w:tcPr>
@@ -2276,7 +2276,7 @@
         </w:trPr>
         <w:tc>
           <w:tcPr>
-            <w:tcW w:w="823" w:type="dxa"/>
+            <w:tcW w:w="822" w:type="dxa"/>
             <w:tcBorders/>
             <w:vAlign w:val="center"/>
           </w:tcPr>
@@ -2302,7 +2302,7 @@
         </w:tc>
         <w:tc>
           <w:tcPr>
-            <w:tcW w:w="1661" w:type="dxa"/>
+            <w:tcW w:w="1662" w:type="dxa"/>
             <w:tcBorders/>
             <w:vAlign w:val="center"/>
           </w:tcPr>
@@ -2385,7 +2385,7 @@
         </w:trPr>
         <w:tc>
           <w:tcPr>
-            <w:tcW w:w="823" w:type="dxa"/>
+            <w:tcW w:w="822" w:type="dxa"/>
             <w:tcBorders/>
             <w:vAlign w:val="center"/>
           </w:tcPr>
@@ -2411,7 +2411,7 @@
         </w:tc>
         <w:tc>
           <w:tcPr>
-            <w:tcW w:w="1661" w:type="dxa"/>
+            <w:tcW w:w="1662" w:type="dxa"/>
             <w:tcBorders/>
             <w:vAlign w:val="center"/>
           </w:tcPr>
@@ -2494,7 +2494,7 @@
         </w:trPr>
         <w:tc>
           <w:tcPr>
-            <w:tcW w:w="823" w:type="dxa"/>
+            <w:tcW w:w="822" w:type="dxa"/>
             <w:tcBorders/>
             <w:vAlign w:val="center"/>
           </w:tcPr>
@@ -2520,7 +2520,7 @@
         </w:tc>
         <w:tc>
           <w:tcPr>
-            <w:tcW w:w="1661" w:type="dxa"/>
+            <w:tcW w:w="1662" w:type="dxa"/>
             <w:tcBorders/>
             <w:vAlign w:val="center"/>
           </w:tcPr>
@@ -2603,7 +2603,7 @@
         </w:trPr>
         <w:tc>
           <w:tcPr>
-            <w:tcW w:w="823" w:type="dxa"/>
+            <w:tcW w:w="822" w:type="dxa"/>
             <w:tcBorders/>
             <w:vAlign w:val="center"/>
           </w:tcPr>
@@ -2629,7 +2629,7 @@
         </w:tc>
         <w:tc>
           <w:tcPr>
-            <w:tcW w:w="1661" w:type="dxa"/>
+            <w:tcW w:w="1662" w:type="dxa"/>
             <w:tcBorders/>
             <w:vAlign w:val="center"/>
           </w:tcPr>
@@ -2827,7 +2827,6 @@
                             </w:pPr>
                             <w:r>
                               <w:rPr>
-                                <w:color w:val="000000"/>
                                 <w:sz w:val="40"/>
                               </w:rPr>
                             </w:r>
@@ -2842,7 +2841,6 @@
                             </w:pPr>
                             <w:r>
                               <w:rPr>
-                                <w:color w:val="000000"/>
                                 <w:sz w:val="40"/>
                               </w:rPr>
                             </w:r>
@@ -2857,7 +2855,6 @@
                             </w:pPr>
                             <w:r>
                               <w:rPr>
-                                <w:color w:val="000000"/>
                                 <w:sz w:val="40"/>
                               </w:rPr>
                             </w:r>
@@ -2872,7 +2869,6 @@
                             </w:pPr>
                             <w:r>
                               <w:rPr>
-                                <w:color w:val="000000"/>
                                 <w:sz w:val="40"/>
                               </w:rPr>
                             </w:r>
@@ -2887,7 +2883,6 @@
                             </w:pPr>
                             <w:r>
                               <w:rPr>
-                                <w:color w:val="000000"/>
                                 <w:sz w:val="40"/>
                               </w:rPr>
                             </w:r>
@@ -2902,7 +2897,6 @@
                             </w:pPr>
                             <w:r>
                               <w:rPr>
-                                <w:color w:val="000000"/>
                                 <w:sz w:val="40"/>
                               </w:rPr>
                             </w:r>
@@ -2917,7 +2911,6 @@
                             </w:pPr>
                             <w:r>
                               <w:rPr>
-                                <w:color w:val="000000"/>
                                 <w:sz w:val="40"/>
                               </w:rPr>
                             </w:r>
@@ -2932,7 +2925,6 @@
                             </w:pPr>
                             <w:r>
                               <w:rPr>
-                                <w:color w:val="000000"/>
                                 <w:sz w:val="40"/>
                               </w:rPr>
                             </w:r>
@@ -2947,7 +2939,6 @@
                             </w:pPr>
                             <w:r>
                               <w:rPr>
-                                <w:color w:val="000000"/>
                                 <w:sz w:val="40"/>
                               </w:rPr>
                             </w:r>
@@ -2962,7 +2953,6 @@
                             </w:pPr>
                             <w:r>
                               <w:rPr>
-                                <w:color w:val="000000"/>
                                 <w:sz w:val="40"/>
                               </w:rPr>
                             </w:r>
@@ -2977,7 +2967,6 @@
                             </w:pPr>
                             <w:r>
                               <w:rPr>
-                                <w:color w:val="000000"/>
                                 <w:sz w:val="40"/>
                               </w:rPr>
                             </w:r>
@@ -2992,7 +2981,6 @@
                             </w:pPr>
                             <w:r>
                               <w:rPr>
-                                <w:color w:val="000000"/>
                                 <w:sz w:val="40"/>
                               </w:rPr>
                             </w:r>
@@ -3007,7 +2995,6 @@
                             </w:pPr>
                             <w:r>
                               <w:rPr>
-                                <w:color w:val="000000"/>
                                 <w:sz w:val="40"/>
                               </w:rPr>
                             </w:r>
@@ -3022,7 +3009,6 @@
                             </w:pPr>
                             <w:r>
                               <w:rPr>
-                                <w:color w:val="000000"/>
                                 <w:sz w:val="40"/>
                               </w:rPr>
                             </w:r>
@@ -3037,7 +3023,6 @@
                             </w:pPr>
                             <w:r>
                               <w:rPr>
-                                <w:color w:val="000000"/>
                                 <w:sz w:val="40"/>
                               </w:rPr>
                             </w:r>
@@ -3052,7 +3037,6 @@
                             </w:pPr>
                             <w:r>
                               <w:rPr>
-                                <w:color w:val="000000"/>
                                 <w:sz w:val="40"/>
                               </w:rPr>
                             </w:r>
@@ -3067,7 +3051,6 @@
                             </w:pPr>
                             <w:r>
                               <w:rPr>
-                                <w:color w:val="000000"/>
                                 <w:sz w:val="40"/>
                               </w:rPr>
                             </w:r>
@@ -3082,7 +3065,6 @@
                             </w:pPr>
                             <w:r>
                               <w:rPr>
-                                <w:color w:val="000000"/>
                                 <w:sz w:val="40"/>
                               </w:rPr>
                             </w:r>
@@ -3097,7 +3079,6 @@
                             </w:pPr>
                             <w:r>
                               <w:rPr>
-                                <w:color w:val="000000"/>
                                 <w:sz w:val="40"/>
                               </w:rPr>
                             </w:r>
@@ -3112,7 +3093,6 @@
                             </w:pPr>
                             <w:r>
                               <w:rPr>
-                                <w:color w:val="000000"/>
                                 <w:sz w:val="40"/>
                               </w:rPr>
                             </w:r>
@@ -3127,7 +3107,6 @@
                             </w:pPr>
                             <w:r>
                               <w:rPr>
-                                <w:color w:val="000000"/>
                                 <w:sz w:val="40"/>
                               </w:rPr>
                             </w:r>
@@ -3141,9 +3120,7 @@
                               </w:rPr>
                             </w:pPr>
                             <w:r>
-                              <w:rPr>
-                                <w:color w:val="000000"/>
-                              </w:rPr>
+                              <w:rPr/>
                             </w:r>
                           </w:p>
                         </w:txbxContent>
@@ -3208,7 +3185,6 @@
                       </w:pPr>
                       <w:r>
                         <w:rPr>
-                          <w:color w:val="000000"/>
                           <w:sz w:val="40"/>
                         </w:rPr>
                       </w:r>
@@ -3223,7 +3199,6 @@
                       </w:pPr>
                       <w:r>
                         <w:rPr>
-                          <w:color w:val="000000"/>
                           <w:sz w:val="40"/>
                         </w:rPr>
                       </w:r>
@@ -3238,7 +3213,6 @@
                       </w:pPr>
                       <w:r>
                         <w:rPr>
-                          <w:color w:val="000000"/>
                           <w:sz w:val="40"/>
                         </w:rPr>
                       </w:r>
@@ -3253,7 +3227,6 @@
                       </w:pPr>
                       <w:r>
                         <w:rPr>
-                          <w:color w:val="000000"/>
                           <w:sz w:val="40"/>
                         </w:rPr>
                       </w:r>
@@ -3268,7 +3241,6 @@
                       </w:pPr>
                       <w:r>
                         <w:rPr>
-                          <w:color w:val="000000"/>
                           <w:sz w:val="40"/>
                         </w:rPr>
                       </w:r>
@@ -3283,7 +3255,6 @@
                       </w:pPr>
                       <w:r>
                         <w:rPr>
-                          <w:color w:val="000000"/>
                           <w:sz w:val="40"/>
                         </w:rPr>
                       </w:r>
@@ -3298,7 +3269,6 @@
                       </w:pPr>
                       <w:r>
                         <w:rPr>
-                          <w:color w:val="000000"/>
                           <w:sz w:val="40"/>
                         </w:rPr>
                       </w:r>
@@ -3313,7 +3283,6 @@
                       </w:pPr>
                       <w:r>
                         <w:rPr>
-                          <w:color w:val="000000"/>
                           <w:sz w:val="40"/>
                         </w:rPr>
                       </w:r>
@@ -3328,7 +3297,6 @@
                       </w:pPr>
                       <w:r>
                         <w:rPr>
-                          <w:color w:val="000000"/>
                           <w:sz w:val="40"/>
                         </w:rPr>
                       </w:r>
@@ -3343,7 +3311,6 @@
                       </w:pPr>
                       <w:r>
                         <w:rPr>
-                          <w:color w:val="000000"/>
                           <w:sz w:val="40"/>
                         </w:rPr>
                       </w:r>
@@ -3358,7 +3325,6 @@
                       </w:pPr>
                       <w:r>
                         <w:rPr>
-                          <w:color w:val="000000"/>
                           <w:sz w:val="40"/>
                         </w:rPr>
                       </w:r>
@@ -3373,7 +3339,6 @@
                       </w:pPr>
                       <w:r>
                         <w:rPr>
-                          <w:color w:val="000000"/>
                           <w:sz w:val="40"/>
                         </w:rPr>
                       </w:r>
@@ -3388,7 +3353,6 @@
                       </w:pPr>
                       <w:r>
                         <w:rPr>
-                          <w:color w:val="000000"/>
                           <w:sz w:val="40"/>
                         </w:rPr>
                       </w:r>
@@ -3403,7 +3367,6 @@
                       </w:pPr>
                       <w:r>
                         <w:rPr>
-                          <w:color w:val="000000"/>
                           <w:sz w:val="40"/>
                         </w:rPr>
                       </w:r>
@@ -3418,7 +3381,6 @@
                       </w:pPr>
                       <w:r>
                         <w:rPr>
-                          <w:color w:val="000000"/>
                           <w:sz w:val="40"/>
                         </w:rPr>
                       </w:r>
@@ -3433,7 +3395,6 @@
                       </w:pPr>
                       <w:r>
                         <w:rPr>
-                          <w:color w:val="000000"/>
                           <w:sz w:val="40"/>
                         </w:rPr>
                       </w:r>
@@ -3448,7 +3409,6 @@
                       </w:pPr>
                       <w:r>
                         <w:rPr>
-                          <w:color w:val="000000"/>
                           <w:sz w:val="40"/>
                         </w:rPr>
                       </w:r>
@@ -3463,7 +3423,6 @@
                       </w:pPr>
                       <w:r>
                         <w:rPr>
-                          <w:color w:val="000000"/>
                           <w:sz w:val="40"/>
                         </w:rPr>
                       </w:r>
@@ -3478,7 +3437,6 @@
                       </w:pPr>
                       <w:r>
                         <w:rPr>
-                          <w:color w:val="000000"/>
                           <w:sz w:val="40"/>
                         </w:rPr>
                       </w:r>
@@ -3493,7 +3451,6 @@
                       </w:pPr>
                       <w:r>
                         <w:rPr>
-                          <w:color w:val="000000"/>
                           <w:sz w:val="40"/>
                         </w:rPr>
                       </w:r>
@@ -3508,7 +3465,6 @@
                       </w:pPr>
                       <w:r>
                         <w:rPr>
-                          <w:color w:val="000000"/>
                           <w:sz w:val="40"/>
                         </w:rPr>
                       </w:r>
@@ -3522,9 +3478,7 @@
                         </w:rPr>
                       </w:pPr>
                       <w:r>
-                        <w:rPr>
-                          <w:color w:val="000000"/>
-                        </w:rPr>
+                        <w:rPr/>
                       </w:r>
                     </w:p>
                   </w:txbxContent>
@@ -3586,7 +3540,7 @@
           <w:docPartGallery w:val="Table of Contents"/>
           <w:docPartUnique w:val="true"/>
         </w:docPartObj>
-        <w:id w:val="247452431"/>
+        <w:id w:val="751405083"/>
       </w:sdtPr>
       <w:sdtContent>
         <w:p>
@@ -4849,17 +4803,7 @@
           <w:color w:val="C9211E"/>
           <w:szCs w:val="20"/>
         </w:rPr>
-        <w:t xml:space="preserve">PNB: </w:t>
-      </w:r>
-      <w:r>
-        <w:rPr>
-          <w:rFonts w:eastAsia="맑은 고딕" w:eastAsiaTheme="majorHAnsi"/>
-          <w:b/>
-          <w:bCs/>
-          <w:color w:val="C9211E"/>
-          <w:szCs w:val="20"/>
-        </w:rPr>
-        <w:t>These steps are needed for “Model file directory (copied in advance)” in 4.1 below (2026.02.28)</w:t>
+        <w:t>PNB: These steps are needed for “Model file directory (copied in advance)” in 4.1 below (2026.02.28)</w:t>
       </w:r>
     </w:p>
     <w:p>
@@ -4876,23 +4820,58 @@
           <w:color w:val="C9211E"/>
           <w:szCs w:val="20"/>
         </w:rPr>
-        <w:t>//</w:t>
-      </w:r>
+        <w:t>//1.1 a. install huggingface_hub</w:t>
+      </w:r>
+    </w:p>
+    <w:p>
+      <w:pPr>
+        <w:pStyle w:val="Normal"/>
+        <w:jc w:val="both"/>
+        <w:rPr>
+          <w:color w:val="2A6099"/>
+        </w:rPr>
+      </w:pPr>
+      <w:r>
+        <w:rPr>
+          <w:rFonts w:eastAsia="맑은 고딕" w:eastAsiaTheme="majorHAnsi"/>
+          <w:color w:val="2A6099"/>
+          <w:szCs w:val="20"/>
+        </w:rPr>
+        <w:t>pip install -U huggingface_hub</w:t>
+      </w:r>
+    </w:p>
+    <w:p>
+      <w:pPr>
+        <w:pStyle w:val="Normal"/>
+        <w:jc w:val="both"/>
+        <w:rPr>
+          <w:color w:val="C9211E"/>
+        </w:rPr>
+      </w:pPr>
       <w:r>
         <w:rPr>
           <w:rFonts w:eastAsia="맑은 고딕" w:eastAsiaTheme="majorHAnsi"/>
           <w:color w:val="C9211E"/>
           <w:szCs w:val="20"/>
         </w:rPr>
-        <w:t xml:space="preserve">1.1 </w:t>
-      </w:r>
+        <w:t>//1.1 b. after getting an account on hugging face, and confirming your email to activate the account, generate a token</w:t>
+      </w:r>
+    </w:p>
+    <w:p>
+      <w:pPr>
+        <w:pStyle w:val="Normal"/>
+        <w:jc w:val="both"/>
+        <w:rPr>
+          <w:color w:val="C9211E"/>
+        </w:rPr>
+      </w:pPr>
       <w:r>
         <w:rPr>
           <w:rFonts w:eastAsia="맑은 고딕" w:eastAsiaTheme="majorHAnsi"/>
           <w:color w:val="C9211E"/>
           <w:szCs w:val="20"/>
         </w:rPr>
-        <w:t>a. install huggingface_hub</w:t>
+        <w:t xml:space="preserve">//1.1 c. afterwards login in to huggingface from the cli using </w:t>
       </w:r>
     </w:p>
     <w:p>
@@ -4909,7 +4888,7 @@
           <w:color w:val="2A6099"/>
           <w:szCs w:val="20"/>
         </w:rPr>
-        <w:t>pip install -U huggingface_hub</w:t>
+        <w:t>huggingface-cli login --token &lt;token&gt;</w:t>
       </w:r>
     </w:p>
     <w:p>
@@ -4926,56 +4905,56 @@
           <w:color w:val="C9211E"/>
           <w:szCs w:val="20"/>
         </w:rPr>
-        <w:t>//</w:t>
-      </w:r>
+        <w:t xml:space="preserve">//1.1 d. Create a folder to Download Stable Diffusion ( ‘CompVis Stable Diffusion v1.4’ in my case) as a safetensor file after accepting the license </w:t>
+      </w:r>
+    </w:p>
+    <w:p>
+      <w:pPr>
+        <w:pStyle w:val="Normal"/>
+        <w:jc w:val="both"/>
+        <w:rPr>
+          <w:color w:val="2A6099"/>
+        </w:rPr>
+      </w:pPr>
+      <w:r>
+        <w:rPr>
+          <w:rFonts w:eastAsia="맑은 고딕" w:eastAsiaTheme="majorHAnsi"/>
+          <w:color w:val="2A6099"/>
+          <w:szCs w:val="20"/>
+        </w:rPr>
+        <w:t>mkdir -p “~/Download/sd-models”</w:t>
+      </w:r>
+    </w:p>
+    <w:p>
+      <w:pPr>
+        <w:pStyle w:val="Normal"/>
+        <w:jc w:val="both"/>
+        <w:rPr>
+          <w:color w:val="2A6099"/>
+        </w:rPr>
+      </w:pPr>
+      <w:r>
+        <w:rPr>
+          <w:color w:val="2A6099"/>
+        </w:rPr>
+        <w:t>huggingface-cli download runwayml/stable-diffusion-v1-5   v1-5-pruned-emaonly.safetensors   --local-dir ~/Downloads/sd-models/</w:t>
+      </w:r>
+    </w:p>
+    <w:p>
+      <w:pPr>
+        <w:pStyle w:val="Normal"/>
+        <w:jc w:val="both"/>
+        <w:rPr>
+          <w:color w:val="C9211E"/>
+        </w:rPr>
+      </w:pPr>
       <w:r>
         <w:rPr>
           <w:rFonts w:eastAsia="맑은 고딕" w:eastAsiaTheme="majorHAnsi"/>
           <w:color w:val="C9211E"/>
           <w:szCs w:val="20"/>
         </w:rPr>
-        <w:t xml:space="preserve">1.1 </w:t>
-      </w:r>
-      <w:r>
-        <w:rPr>
-          <w:rFonts w:eastAsia="맑은 고딕" w:eastAsiaTheme="majorHAnsi"/>
-          <w:color w:val="C9211E"/>
-          <w:szCs w:val="20"/>
-        </w:rPr>
-        <w:t>b. after getting an account on hugging face, and confirming your email to activate the account, generate a token</w:t>
-      </w:r>
-    </w:p>
-    <w:p>
-      <w:pPr>
-        <w:pStyle w:val="Normal"/>
-        <w:jc w:val="both"/>
-        <w:rPr>
-          <w:color w:val="C9211E"/>
-        </w:rPr>
-      </w:pPr>
-      <w:r>
-        <w:rPr>
-          <w:rFonts w:eastAsia="맑은 고딕" w:eastAsiaTheme="majorHAnsi"/>
-          <w:color w:val="C9211E"/>
-          <w:szCs w:val="20"/>
-        </w:rPr>
-        <w:t>//</w:t>
-      </w:r>
-      <w:r>
-        <w:rPr>
-          <w:rFonts w:eastAsia="맑은 고딕" w:eastAsiaTheme="majorHAnsi"/>
-          <w:color w:val="C9211E"/>
-          <w:szCs w:val="20"/>
-        </w:rPr>
-        <w:t xml:space="preserve">1.1 </w:t>
-      </w:r>
-      <w:r>
-        <w:rPr>
-          <w:rFonts w:eastAsia="맑은 고딕" w:eastAsiaTheme="majorHAnsi"/>
-          <w:color w:val="C9211E"/>
-          <w:szCs w:val="20"/>
-        </w:rPr>
-        <w:t xml:space="preserve">c. afterwards login in to huggingface from the cli using </w:t>
+        <w:t>//1.1 d. Move the downloaded model to “/tmp/models/” and make sure that the folder is read and writable by changing from root ownership</w:t>
       </w:r>
     </w:p>
     <w:p>
@@ -4992,32 +4971,7 @@
           <w:color w:val="2A6099"/>
           <w:szCs w:val="20"/>
         </w:rPr>
-        <w:t>huggingface-cli login --token &lt;token&gt;</w:t>
-      </w:r>
-    </w:p>
-    <w:p>
-      <w:pPr>
-        <w:pStyle w:val="Normal"/>
-        <w:jc w:val="both"/>
-        <w:rPr>
-          <w:color w:val="C9211E"/>
-        </w:rPr>
-      </w:pPr>
-      <w:r>
-        <w:rPr>
-          <w:rFonts w:eastAsia="맑은 고딕" w:eastAsiaTheme="majorHAnsi"/>
-          <w:color w:val="C9211E"/>
-          <w:szCs w:val="20"/>
-        </w:rPr>
-        <w:t>//</w:t>
-      </w:r>
-      <w:r>
-        <w:rPr>
-          <w:rFonts w:eastAsia="맑은 고딕" w:eastAsiaTheme="majorHAnsi"/>
-          <w:color w:val="C9211E"/>
-          <w:szCs w:val="20"/>
-        </w:rPr>
-        <w:t xml:space="preserve">1.1 d. Create a folder to Download Stable Diffusion ( ‘CompVis Stable Diffusion v1.4’ in my case) as a safetensor file after accepting the license </w:t>
+        <w:t>sudo mv ~/sd-models/v1-5-pruned-emaonly.safetensors /tmp/model/</w:t>
       </w:r>
     </w:p>
     <w:p>
@@ -5034,80 +4988,6 @@
           <w:color w:val="2A6099"/>
           <w:szCs w:val="20"/>
         </w:rPr>
-        <w:t>mkdir -p “~/Download/sd-models”</w:t>
-      </w:r>
-    </w:p>
-    <w:p>
-      <w:pPr>
-        <w:pStyle w:val="Normal"/>
-        <w:jc w:val="both"/>
-        <w:rPr>
-          <w:color w:val="2A6099"/>
-        </w:rPr>
-      </w:pPr>
-      <w:r>
-        <w:rPr>
-          <w:color w:val="2A6099"/>
-        </w:rPr>
-        <w:t>huggingface-cli download runwayml/stable-diffusion-v1-5   v1-5-pruned-emaonly.safetensors   --local-dir ~/Downloads/sd-models/</w:t>
-      </w:r>
-    </w:p>
-    <w:p>
-      <w:pPr>
-        <w:pStyle w:val="Normal"/>
-        <w:jc w:val="both"/>
-        <w:rPr>
-          <w:color w:val="C9211E"/>
-        </w:rPr>
-      </w:pPr>
-      <w:r>
-        <w:rPr>
-          <w:rFonts w:eastAsia="맑은 고딕" w:eastAsiaTheme="majorHAnsi"/>
-          <w:color w:val="C9211E"/>
-          <w:szCs w:val="20"/>
-        </w:rPr>
-        <w:t>//</w:t>
-      </w:r>
-      <w:r>
-        <w:rPr>
-          <w:rFonts w:eastAsia="맑은 고딕" w:eastAsiaTheme="majorHAnsi"/>
-          <w:color w:val="C9211E"/>
-          <w:szCs w:val="20"/>
-        </w:rPr>
-        <w:t>1.1 d. Move the downloaded model to “/tmp/models/” and make sure that the folder is read and writable by changing from root ownership</w:t>
-      </w:r>
-    </w:p>
-    <w:p>
-      <w:pPr>
-        <w:pStyle w:val="Normal"/>
-        <w:jc w:val="both"/>
-        <w:rPr>
-          <w:color w:val="2A6099"/>
-        </w:rPr>
-      </w:pPr>
-      <w:r>
-        <w:rPr>
-          <w:rFonts w:eastAsia="맑은 고딕" w:eastAsiaTheme="majorHAnsi"/>
-          <w:color w:val="2A6099"/>
-          <w:szCs w:val="20"/>
-        </w:rPr>
-        <w:t>sudo mv ~/sd-models/v1-5-pruned-emaonly.safetensors /tmp/model/</w:t>
-      </w:r>
-    </w:p>
-    <w:p>
-      <w:pPr>
-        <w:pStyle w:val="Normal"/>
-        <w:jc w:val="both"/>
-        <w:rPr>
-          <w:color w:val="2A6099"/>
-        </w:rPr>
-      </w:pPr>
-      <w:r>
-        <w:rPr>
-          <w:rFonts w:eastAsia="맑은 고딕" w:eastAsiaTheme="majorHAnsi"/>
-          <w:color w:val="2A6099"/>
-          <w:szCs w:val="20"/>
-        </w:rPr>
         <w:t>sudo chown -R $USER:$USER /tmp/model</w:t>
       </w:r>
     </w:p>
@@ -5121,7 +5001,10 @@
         </w:rPr>
       </w:pPr>
       <w:r>
-        <w:rPr/>
+        <w:rPr>
+          <w:rFonts w:eastAsia="맑은 고딕" w:eastAsiaTheme="majorHAnsi"/>
+          <w:szCs w:val="20"/>
+        </w:rPr>
       </w:r>
     </w:p>
     <w:p>
@@ -8354,24 +8237,20 @@
         <w:rPr>
           <w:color w:val="C9211E"/>
         </w:rPr>
-        <w:t xml:space="preserve">PNB: Then run 4.2-6. </w:t>
-      </w:r>
-      <w:r>
+        <w:t>PNB: Then run 4.2-6. (I run this after everything was set)</w:t>
+      </w:r>
+    </w:p>
+    <w:p>
+      <w:pPr>
+        <w:pStyle w:val="Normal"/>
         <w:rPr>
           <w:color w:val="C9211E"/>
         </w:rPr>
-        <w:t>(I run this after everything was set)</w:t>
-      </w:r>
-    </w:p>
-    <w:p>
-      <w:pPr>
-        <w:pStyle w:val="Normal"/>
+      </w:pPr>
+      <w:r>
         <w:rPr>
           <w:color w:val="C9211E"/>
         </w:rPr>
-      </w:pPr>
-      <w:r>
-        <w:rPr/>
       </w:r>
     </w:p>
     <w:p>
@@ -8390,15 +8269,7 @@
           <w:iCs/>
           <w:color w:val="00A933"/>
         </w:rPr>
-        <w:t>O</w:t>
-      </w:r>
-      <w:r>
-        <w:rPr>
-          <w:i/>
-          <w:iCs/>
-          <w:color w:val="00A933"/>
-        </w:rPr>
-        <w:t>riginal Command by Heesik:</w:t>
+        <w:t>Original Command by Heesik:</w:t>
       </w:r>
     </w:p>
     <w:p>
@@ -8481,13 +8352,7 @@
         <w:rPr>
           <w:color w:val="C9211E"/>
         </w:rPr>
-        <w:t xml:space="preserve">PNB: Then run 4.2-6. </w:t>
-      </w:r>
-      <w:r>
-        <w:rPr>
-          <w:color w:val="C9211E"/>
-        </w:rPr>
-        <w:t>I use this one rather than the gpu one above for quick confirmation that both server and client are working</w:t>
+        <w:t>PNB: Then run 4.2-6. I use this one rather than the gpu one above for quick confirmation that both server and client are working</w:t>
       </w:r>
     </w:p>
     <w:p>
@@ -8542,17 +8407,17 @@
         <w:rPr>
           <w:color w:val="00A933"/>
         </w:rPr>
-        <w:t>This should have been done beforehand (i.e. before attempting to docker connect to server)</w:t>
-      </w:r>
-    </w:p>
-    <w:p>
-      <w:pPr>
-        <w:pStyle w:val="Normal"/>
-        <w:rPr/>
-      </w:pPr>
-      <w:r>
-        <w:rPr/>
-        <w:t>/tmp/model</w:t>
+        <w:t xml:space="preserve">This should have been done beforehand (i.e. before attempting to docker connect to server). </w:t>
+      </w:r>
+      <w:r>
+        <w:rPr>
+          <w:color w:val="00A933"/>
+        </w:rPr>
+        <w:t>It should be copies into “</w:t>
+      </w:r>
+      <w:r>
+        <w:rPr/>
+        <w:t>/tmp/model”</w:t>
       </w:r>
     </w:p>
     <w:p>
@@ -8588,19 +8453,13 @@
         <w:rPr>
           <w:color w:val="FF0000"/>
         </w:rPr>
-        <w:t>//</w:t>
-      </w:r>
-      <w:r>
-        <w:rPr>
-          <w:color w:val="FF0000"/>
-        </w:rPr>
-        <w:t xml:space="preserve">downloading using: </w:t>
+        <w:t xml:space="preserve">//downloading using: </w:t>
       </w:r>
       <w:r>
         <w:rPr>
           <w:color w:val="2A6099"/>
         </w:rPr>
-        <w:t>wget -U mozilla "https://huggingface.co/CompVis/stable-diffusion-v-1-4-original/resolve/c0472cb37716f921bae3d58f9d07ef36a2b2b2bb/sd-v1-4.safetensors</w:t>
+        <w:t>wget -U mozilla "https://huggingface.co/CompVis/stable-diffusion-v-1-4-original/resolve/c0472cb37716f921bae3d58f9d07ef36a2b2b2bb/sd-v1-4.safetensors”</w:t>
       </w:r>
     </w:p>
     <w:p>
@@ -8624,6 +8483,83 @@
           <w:color w:val="000000"/>
         </w:rPr>
         <w:t>v1-5-pruned-emaonly.safetensors</w:t>
+      </w:r>
+    </w:p>
+    <w:p>
+      <w:pPr>
+        <w:pStyle w:val="Normal"/>
+        <w:rPr>
+          <w:color w:val="000000"/>
+        </w:rPr>
+      </w:pPr>
+      <w:r>
+        <w:rPr/>
+      </w:r>
+    </w:p>
+    <w:p>
+      <w:pPr>
+        <w:pStyle w:val="Normal"/>
+        <w:rPr/>
+      </w:pPr>
+      <w:r>
+        <w:rPr>
+          <w:color w:val="00A933"/>
+        </w:rPr>
+      </w:r>
+    </w:p>
+    <w:p>
+      <w:pPr>
+        <w:pStyle w:val="Normal"/>
+        <w:rPr>
+          <w:color w:val="00A933"/>
+        </w:rPr>
+      </w:pPr>
+      <w:r>
+        <w:rPr>
+          <w:color w:val="00A933"/>
+        </w:rPr>
+        <w:t xml:space="preserve">// </w:t>
+      </w:r>
+      <w:r>
+        <w:rPr>
+          <w:color w:val="00A933"/>
+        </w:rPr>
+        <w:t xml:space="preserve">Dont forget to copy ‘real_stats.npz’ into </w:t>
+      </w:r>
+      <w:r>
+        <w:rPr>
+          <w:i w:val="false"/>
+          <w:iCs w:val="false"/>
+          <w:color w:val="00A933"/>
+        </w:rPr>
+        <w:t xml:space="preserve">“/tmp/model” as well </w:t>
+      </w:r>
+    </w:p>
+    <w:p>
+      <w:pPr>
+        <w:pStyle w:val="Normal"/>
+        <w:rPr>
+          <w:color w:val="000000"/>
+        </w:rPr>
+      </w:pPr>
+      <w:r>
+        <w:rPr>
+          <w:i w:val="false"/>
+          <w:iCs w:val="false"/>
+          <w:color w:val="000000"/>
+        </w:rPr>
+        <w:t>cp -v &lt;original location of real_stats.npz file&gt; to /tmp/model</w:t>
+      </w:r>
+    </w:p>
+    <w:p>
+      <w:pPr>
+        <w:pStyle w:val="Normal"/>
+        <w:rPr>
+          <w:color w:val="000000"/>
+        </w:rPr>
+      </w:pPr>
+      <w:r>
+        <w:rPr/>
       </w:r>
     </w:p>
     <w:p>
@@ -8642,15 +8578,7 @@
           <w:bCs/>
           <w:color w:val="FF0000"/>
         </w:rPr>
-        <w:t>//</w:t>
-      </w:r>
-      <w:r>
-        <w:rPr>
-          <w:b/>
-          <w:bCs/>
-          <w:color w:val="FF0000"/>
-        </w:rPr>
-        <w:t>PNB: downloaded using . This stage goes with the steps in 1.1 above (2026.02.25)</w:t>
+        <w:t>//PNB: downloaded using . This stage goes with the steps in 1.1 above (2026.02.25)</w:t>
       </w:r>
     </w:p>
     <w:p>
@@ -8882,25 +8810,7 @@
         <w:rPr>
           <w:color w:val="C9211E"/>
         </w:rPr>
-        <w:t>// PNB:before that, you should have do</w:t>
-      </w:r>
-      <w:r>
-        <w:rPr>
-          <w:color w:val="C9211E"/>
-        </w:rPr>
-        <w:t>ne</w:t>
-      </w:r>
-      <w:r>
-        <w:rPr>
-          <w:color w:val="C9211E"/>
-        </w:rPr>
-        <w:t xml:space="preserve"> “pyenv install 3.11.14”. </w:t>
-      </w:r>
-      <w:r>
-        <w:rPr>
-          <w:color w:val="C9211E"/>
-        </w:rPr>
-        <w:t>However to use it, you must either do “pyenv local 3.11.14” to set it locally for only the current folder OR “pyenv global 3.11.14” to set it globally. You can then check with either “pyenv version” OR “python --version”</w:t>
+        <w:t>// PNB:before that, you should have done “pyenv install 3.11.14”. However to use it, you must either do “pyenv local 3.11.14” to set it locally for only the current folder OR “pyenv global 3.11.14” to set it globally. You can then check with either “pyenv version” OR “python --version”</w:t>
       </w:r>
     </w:p>
     <w:p>
@@ -9468,7 +9378,7 @@
         <w:docPartGallery w:val="Page Numbers (Bottom of Page)"/>
         <w:docPartUnique w:val="true"/>
       </w:docPartObj>
-      <w:id w:val="2114525287"/>
+      <w:id w:val="425320877"/>
     </w:sdtPr>
     <w:sdtContent>
       <w:p>

</xml_diff>

<commit_message>
Corrected the majority of the gRPC related errors
</commit_message>
<xml_diff>
--- a/DiffServ_0112_1730_coco2/StableDiffusion추론모듈_20260115_V1.0_GoogleTranslated.docx
+++ b/DiffServ_0112_1730_coco2/StableDiffusion추론모듈_20260115_V1.0_GoogleTranslated.docx
@@ -1,6 +1,6 @@
 
 <file path=word/document.xml><?xml version="1.0" encoding="utf-8"?>
-<w:document xmlns:o="urn:schemas-microsoft-com:office:office" xmlns:r="http://schemas.openxmlformats.org/officeDocument/2006/relationships" xmlns:v="urn:schemas-microsoft-com:vml" xmlns:w="http://schemas.openxmlformats.org/wordprocessingml/2006/main" xmlns:w10="urn:schemas-microsoft-com:office:word" xmlns:wp="http://schemas.openxmlformats.org/drawingml/2006/wordprocessingDrawing" xmlns:wps="http://schemas.microsoft.com/office/word/2010/wordprocessingShape" xmlns:wpg="http://schemas.microsoft.com/office/word/2010/wordprocessingGroup" xmlns:mc="http://schemas.openxmlformats.org/markup-compatibility/2006" xmlns:wp14="http://schemas.microsoft.com/office/word/2010/wordprocessingDrawing" xmlns:w14="http://schemas.microsoft.com/office/word/2010/wordml" xmlns:w15="http://schemas.microsoft.com/office/word/2012/wordml" mc:Ignorable="w14 wp14 w15">
+<w:document xmlns:o="urn:schemas-microsoft-com:office:office" xmlns:r="http://schemas.openxmlformats.org/officeDocument/2006/relationships" xmlns:v="urn:schemas-microsoft-com:vml" xmlns:w="http://schemas.openxmlformats.org/wordprocessingml/2006/main" xmlns:w10="urn:schemas-microsoft-com:office:word" xmlns:wp="http://schemas.openxmlformats.org/drawingml/2006/wordprocessingDrawing" xmlns:pic="http://schemas.openxmlformats.org/drawingml/2006/picture" xmlns:wps="http://schemas.microsoft.com/office/word/2010/wordprocessingShape" xmlns:wpg="http://schemas.microsoft.com/office/word/2010/wordprocessingGroup" xmlns:mc="http://schemas.openxmlformats.org/markup-compatibility/2006" xmlns:wp14="http://schemas.microsoft.com/office/word/2010/wordprocessingDrawing" xmlns:w14="http://schemas.microsoft.com/office/word/2010/wordml" xmlns:w15="http://schemas.microsoft.com/office/word/2012/wordml" mc:Ignorable="w14 wp14 w15">
   <w:body>
     <w:p>
       <w:pPr>
@@ -319,10 +319,10 @@
     <w:p>
       <w:pPr>
         <w:pStyle w:val="Normal"/>
+        <w:spacing w:before="0" w:after="0"/>
         <w:jc w:val="center"/>
         <w:rPr>
           <w:rFonts w:ascii="바탕체" w:hAnsi="바탕체" w:eastAsia="바탕체"/>
-          <w:b/>
           <w:b/>
           <w:bCs/>
           <w:sz w:val="44"/>
@@ -382,7 +382,6 @@
               <w:rPr>
                 <w:rFonts w:ascii="바탕체" w:hAnsi="바탕체" w:eastAsia="바탕체"/>
                 <w:b/>
-                <w:b/>
                 <w:bCs/>
                 <w:sz w:val="22"/>
               </w:rPr>
@@ -418,7 +417,6 @@
               <w:rPr>
                 <w:rFonts w:ascii="바탕체" w:hAnsi="바탕체" w:eastAsia="바탕체"/>
                 <w:b/>
-                <w:b/>
                 <w:bCs/>
                 <w:sz w:val="22"/>
               </w:rPr>
@@ -454,7 +452,6 @@
               <w:rPr>
                 <w:rFonts w:ascii="바탕체" w:hAnsi="바탕체" w:eastAsia="바탕체"/>
                 <w:b/>
-                <w:b/>
                 <w:bCs/>
                 <w:sz w:val="22"/>
               </w:rPr>
@@ -489,7 +486,6 @@
               <w:jc w:val="center"/>
               <w:rPr>
                 <w:rFonts w:ascii="바탕체" w:hAnsi="바탕체" w:eastAsia="바탕체"/>
-                <w:b/>
                 <w:b/>
                 <w:bCs/>
                 <w:sz w:val="22"/>
@@ -2721,20 +2717,21 @@
     </w:p>
     <w:p>
       <w:pPr>
-        <w:pStyle w:val="Contents1"/>
+        <w:pStyle w:val="TOC1"/>
         <w:tabs>
           <w:tab w:val="clear" w:pos="800"/>
           <w:tab w:val="right" w:pos="9016" w:leader="dot"/>
         </w:tabs>
-        <w:rPr/>
-      </w:pPr>
-      <w:r>
-        <w:rPr/>
-      </w:r>
-    </w:p>
-    <w:p>
-      <w:pPr>
-        <w:pStyle w:val="Contents1"/>
+        <w:spacing w:before="0" w:after="0"/>
+        <w:rPr/>
+      </w:pPr>
+      <w:r>
+        <w:rPr/>
+      </w:r>
+    </w:p>
+    <w:p>
+      <w:pPr>
+        <w:pStyle w:val="TOC1"/>
         <w:tabs>
           <w:tab w:val="clear" w:pos="800"/>
           <w:tab w:val="right" w:pos="9016" w:leader="dot"/>
@@ -2746,7 +2743,7 @@
         <mc:AlternateContent>
           <mc:Choice Requires="wps">
             <w:drawing>
-              <wp:anchor behindDoc="0" distT="635" distB="635" distL="0" distR="0" simplePos="0" locked="0" layoutInCell="0" allowOverlap="1" relativeHeight="3">
+              <wp:anchor behindDoc="0" distT="635" distB="635" distL="0" distR="0" simplePos="0" locked="0" layoutInCell="1" allowOverlap="1" relativeHeight="3">
                 <wp:simplePos x="0" y="0"/>
                 <wp:positionH relativeFrom="column">
                   <wp:posOffset>1994535</wp:posOffset>
@@ -2797,7 +2794,7 @@
                         <w:txbxContent>
                           <w:p>
                             <w:pPr>
-                              <w:pStyle w:val="FrameContents"/>
+                              <w:pStyle w:val="FrameContentsuser"/>
                               <w:jc w:val="center"/>
                               <w:rPr>
                                 <w:rFonts w:ascii="Time New Roman" w:hAnsi="Time New Roman" w:eastAsia="HY헤드라인M"/>
@@ -2819,7 +2816,7 @@
                           </w:p>
                           <w:p>
                             <w:pPr>
-                              <w:pStyle w:val="FrameContents"/>
+                              <w:pStyle w:val="FrameContentsuser"/>
                               <w:jc w:val="center"/>
                               <w:rPr>
                                 <w:sz w:val="40"/>
@@ -2827,13 +2824,14 @@
                             </w:pPr>
                             <w:r>
                               <w:rPr>
+                                <w:color w:val="000000"/>
                                 <w:sz w:val="40"/>
                               </w:rPr>
                             </w:r>
                           </w:p>
                           <w:p>
                             <w:pPr>
-                              <w:pStyle w:val="FrameContents"/>
+                              <w:pStyle w:val="FrameContentsuser"/>
                               <w:jc w:val="center"/>
                               <w:rPr>
                                 <w:sz w:val="40"/>
@@ -2841,13 +2839,14 @@
                             </w:pPr>
                             <w:r>
                               <w:rPr>
+                                <w:color w:val="000000"/>
                                 <w:sz w:val="40"/>
                               </w:rPr>
                             </w:r>
                           </w:p>
                           <w:p>
                             <w:pPr>
-                              <w:pStyle w:val="FrameContents"/>
+                              <w:pStyle w:val="FrameContentsuser"/>
                               <w:jc w:val="center"/>
                               <w:rPr>
                                 <w:sz w:val="40"/>
@@ -2855,13 +2854,14 @@
                             </w:pPr>
                             <w:r>
                               <w:rPr>
+                                <w:color w:val="000000"/>
                                 <w:sz w:val="40"/>
                               </w:rPr>
                             </w:r>
                           </w:p>
                           <w:p>
                             <w:pPr>
-                              <w:pStyle w:val="FrameContents"/>
+                              <w:pStyle w:val="FrameContentsuser"/>
                               <w:jc w:val="center"/>
                               <w:rPr>
                                 <w:sz w:val="40"/>
@@ -2869,13 +2869,14 @@
                             </w:pPr>
                             <w:r>
                               <w:rPr>
+                                <w:color w:val="000000"/>
                                 <w:sz w:val="40"/>
                               </w:rPr>
                             </w:r>
                           </w:p>
                           <w:p>
                             <w:pPr>
-                              <w:pStyle w:val="FrameContents"/>
+                              <w:pStyle w:val="FrameContentsuser"/>
                               <w:jc w:val="center"/>
                               <w:rPr>
                                 <w:sz w:val="40"/>
@@ -2883,13 +2884,14 @@
                             </w:pPr>
                             <w:r>
                               <w:rPr>
+                                <w:color w:val="000000"/>
                                 <w:sz w:val="40"/>
                               </w:rPr>
                             </w:r>
                           </w:p>
                           <w:p>
                             <w:pPr>
-                              <w:pStyle w:val="FrameContents"/>
+                              <w:pStyle w:val="FrameContentsuser"/>
                               <w:jc w:val="center"/>
                               <w:rPr>
                                 <w:sz w:val="40"/>
@@ -2897,13 +2899,14 @@
                             </w:pPr>
                             <w:r>
                               <w:rPr>
+                                <w:color w:val="000000"/>
                                 <w:sz w:val="40"/>
                               </w:rPr>
                             </w:r>
                           </w:p>
                           <w:p>
                             <w:pPr>
-                              <w:pStyle w:val="FrameContents"/>
+                              <w:pStyle w:val="FrameContentsuser"/>
                               <w:jc w:val="center"/>
                               <w:rPr>
                                 <w:sz w:val="40"/>
@@ -2911,13 +2914,14 @@
                             </w:pPr>
                             <w:r>
                               <w:rPr>
+                                <w:color w:val="000000"/>
                                 <w:sz w:val="40"/>
                               </w:rPr>
                             </w:r>
                           </w:p>
                           <w:p>
                             <w:pPr>
-                              <w:pStyle w:val="FrameContents"/>
+                              <w:pStyle w:val="FrameContentsuser"/>
                               <w:jc w:val="center"/>
                               <w:rPr>
                                 <w:sz w:val="40"/>
@@ -2925,13 +2929,14 @@
                             </w:pPr>
                             <w:r>
                               <w:rPr>
+                                <w:color w:val="000000"/>
                                 <w:sz w:val="40"/>
                               </w:rPr>
                             </w:r>
                           </w:p>
                           <w:p>
                             <w:pPr>
-                              <w:pStyle w:val="FrameContents"/>
+                              <w:pStyle w:val="FrameContentsuser"/>
                               <w:jc w:val="center"/>
                               <w:rPr>
                                 <w:sz w:val="40"/>
@@ -2939,13 +2944,14 @@
                             </w:pPr>
                             <w:r>
                               <w:rPr>
+                                <w:color w:val="000000"/>
                                 <w:sz w:val="40"/>
                               </w:rPr>
                             </w:r>
                           </w:p>
                           <w:p>
                             <w:pPr>
-                              <w:pStyle w:val="FrameContents"/>
+                              <w:pStyle w:val="FrameContentsuser"/>
                               <w:jc w:val="center"/>
                               <w:rPr>
                                 <w:sz w:val="40"/>
@@ -2953,13 +2959,14 @@
                             </w:pPr>
                             <w:r>
                               <w:rPr>
+                                <w:color w:val="000000"/>
                                 <w:sz w:val="40"/>
                               </w:rPr>
                             </w:r>
                           </w:p>
                           <w:p>
                             <w:pPr>
-                              <w:pStyle w:val="FrameContents"/>
+                              <w:pStyle w:val="FrameContentsuser"/>
                               <w:jc w:val="center"/>
                               <w:rPr>
                                 <w:sz w:val="40"/>
@@ -2967,13 +2974,14 @@
                             </w:pPr>
                             <w:r>
                               <w:rPr>
+                                <w:color w:val="000000"/>
                                 <w:sz w:val="40"/>
                               </w:rPr>
                             </w:r>
                           </w:p>
                           <w:p>
                             <w:pPr>
-                              <w:pStyle w:val="FrameContents"/>
+                              <w:pStyle w:val="FrameContentsuser"/>
                               <w:jc w:val="center"/>
                               <w:rPr>
                                 <w:sz w:val="40"/>
@@ -2981,13 +2989,14 @@
                             </w:pPr>
                             <w:r>
                               <w:rPr>
+                                <w:color w:val="000000"/>
                                 <w:sz w:val="40"/>
                               </w:rPr>
                             </w:r>
                           </w:p>
                           <w:p>
                             <w:pPr>
-                              <w:pStyle w:val="FrameContents"/>
+                              <w:pStyle w:val="FrameContentsuser"/>
                               <w:jc w:val="center"/>
                               <w:rPr>
                                 <w:sz w:val="40"/>
@@ -2995,13 +3004,14 @@
                             </w:pPr>
                             <w:r>
                               <w:rPr>
+                                <w:color w:val="000000"/>
                                 <w:sz w:val="40"/>
                               </w:rPr>
                             </w:r>
                           </w:p>
                           <w:p>
                             <w:pPr>
-                              <w:pStyle w:val="FrameContents"/>
+                              <w:pStyle w:val="FrameContentsuser"/>
                               <w:jc w:val="center"/>
                               <w:rPr>
                                 <w:sz w:val="40"/>
@@ -3009,13 +3019,14 @@
                             </w:pPr>
                             <w:r>
                               <w:rPr>
+                                <w:color w:val="000000"/>
                                 <w:sz w:val="40"/>
                               </w:rPr>
                             </w:r>
                           </w:p>
                           <w:p>
                             <w:pPr>
-                              <w:pStyle w:val="FrameContents"/>
+                              <w:pStyle w:val="FrameContentsuser"/>
                               <w:jc w:val="center"/>
                               <w:rPr>
                                 <w:sz w:val="40"/>
@@ -3023,13 +3034,14 @@
                             </w:pPr>
                             <w:r>
                               <w:rPr>
+                                <w:color w:val="000000"/>
                                 <w:sz w:val="40"/>
                               </w:rPr>
                             </w:r>
                           </w:p>
                           <w:p>
                             <w:pPr>
-                              <w:pStyle w:val="FrameContents"/>
+                              <w:pStyle w:val="FrameContentsuser"/>
                               <w:jc w:val="center"/>
                               <w:rPr>
                                 <w:sz w:val="40"/>
@@ -3037,13 +3049,14 @@
                             </w:pPr>
                             <w:r>
                               <w:rPr>
+                                <w:color w:val="000000"/>
                                 <w:sz w:val="40"/>
                               </w:rPr>
                             </w:r>
                           </w:p>
                           <w:p>
                             <w:pPr>
-                              <w:pStyle w:val="FrameContents"/>
+                              <w:pStyle w:val="FrameContentsuser"/>
                               <w:jc w:val="center"/>
                               <w:rPr>
                                 <w:sz w:val="40"/>
@@ -3051,13 +3064,14 @@
                             </w:pPr>
                             <w:r>
                               <w:rPr>
+                                <w:color w:val="000000"/>
                                 <w:sz w:val="40"/>
                               </w:rPr>
                             </w:r>
                           </w:p>
                           <w:p>
                             <w:pPr>
-                              <w:pStyle w:val="FrameContents"/>
+                              <w:pStyle w:val="FrameContentsuser"/>
                               <w:jc w:val="center"/>
                               <w:rPr>
                                 <w:sz w:val="40"/>
@@ -3065,13 +3079,14 @@
                             </w:pPr>
                             <w:r>
                               <w:rPr>
+                                <w:color w:val="000000"/>
                                 <w:sz w:val="40"/>
                               </w:rPr>
                             </w:r>
                           </w:p>
                           <w:p>
                             <w:pPr>
-                              <w:pStyle w:val="FrameContents"/>
+                              <w:pStyle w:val="FrameContentsuser"/>
                               <w:jc w:val="center"/>
                               <w:rPr>
                                 <w:sz w:val="40"/>
@@ -3079,13 +3094,14 @@
                             </w:pPr>
                             <w:r>
                               <w:rPr>
+                                <w:color w:val="000000"/>
                                 <w:sz w:val="40"/>
                               </w:rPr>
                             </w:r>
                           </w:p>
                           <w:p>
                             <w:pPr>
-                              <w:pStyle w:val="FrameContents"/>
+                              <w:pStyle w:val="FrameContentsuser"/>
                               <w:jc w:val="center"/>
                               <w:rPr>
                                 <w:sz w:val="40"/>
@@ -3093,13 +3109,14 @@
                             </w:pPr>
                             <w:r>
                               <w:rPr>
+                                <w:color w:val="000000"/>
                                 <w:sz w:val="40"/>
                               </w:rPr>
                             </w:r>
                           </w:p>
                           <w:p>
                             <w:pPr>
-                              <w:pStyle w:val="FrameContents"/>
+                              <w:pStyle w:val="FrameContentsuser"/>
                               <w:jc w:val="center"/>
                               <w:rPr>
                                 <w:sz w:val="40"/>
@@ -3107,20 +3124,23 @@
                             </w:pPr>
                             <w:r>
                               <w:rPr>
+                                <w:color w:val="000000"/>
                                 <w:sz w:val="40"/>
                               </w:rPr>
                             </w:r>
                           </w:p>
                           <w:p>
                             <w:pPr>
-                              <w:pStyle w:val="FrameContents"/>
+                              <w:pStyle w:val="FrameContentsuser"/>
                               <w:jc w:val="center"/>
                               <w:rPr>
                                 <w:sz w:val="40"/>
                               </w:rPr>
                             </w:pPr>
                             <w:r>
-                              <w:rPr/>
+                              <w:rPr>
+                                <w:color w:val="000000"/>
+                              </w:rPr>
                             </w:r>
                           </w:p>
                         </w:txbxContent>
@@ -3155,7 +3175,7 @@
                   <w:txbxContent>
                     <w:p>
                       <w:pPr>
-                        <w:pStyle w:val="FrameContents"/>
+                        <w:pStyle w:val="FrameContentsuser"/>
                         <w:jc w:val="center"/>
                         <w:rPr>
                           <w:rFonts w:ascii="Time New Roman" w:hAnsi="Time New Roman" w:eastAsia="HY헤드라인M"/>
@@ -3177,7 +3197,7 @@
                     </w:p>
                     <w:p>
                       <w:pPr>
-                        <w:pStyle w:val="FrameContents"/>
+                        <w:pStyle w:val="FrameContentsuser"/>
                         <w:jc w:val="center"/>
                         <w:rPr>
                           <w:sz w:val="40"/>
@@ -3185,13 +3205,14 @@
                       </w:pPr>
                       <w:r>
                         <w:rPr>
+                          <w:color w:val="000000"/>
                           <w:sz w:val="40"/>
                         </w:rPr>
                       </w:r>
                     </w:p>
                     <w:p>
                       <w:pPr>
-                        <w:pStyle w:val="FrameContents"/>
+                        <w:pStyle w:val="FrameContentsuser"/>
                         <w:jc w:val="center"/>
                         <w:rPr>
                           <w:sz w:val="40"/>
@@ -3199,13 +3220,14 @@
                       </w:pPr>
                       <w:r>
                         <w:rPr>
+                          <w:color w:val="000000"/>
                           <w:sz w:val="40"/>
                         </w:rPr>
                       </w:r>
                     </w:p>
                     <w:p>
                       <w:pPr>
-                        <w:pStyle w:val="FrameContents"/>
+                        <w:pStyle w:val="FrameContentsuser"/>
                         <w:jc w:val="center"/>
                         <w:rPr>
                           <w:sz w:val="40"/>
@@ -3213,13 +3235,14 @@
                       </w:pPr>
                       <w:r>
                         <w:rPr>
+                          <w:color w:val="000000"/>
                           <w:sz w:val="40"/>
                         </w:rPr>
                       </w:r>
                     </w:p>
                     <w:p>
                       <w:pPr>
-                        <w:pStyle w:val="FrameContents"/>
+                        <w:pStyle w:val="FrameContentsuser"/>
                         <w:jc w:val="center"/>
                         <w:rPr>
                           <w:sz w:val="40"/>
@@ -3227,13 +3250,14 @@
                       </w:pPr>
                       <w:r>
                         <w:rPr>
+                          <w:color w:val="000000"/>
                           <w:sz w:val="40"/>
                         </w:rPr>
                       </w:r>
                     </w:p>
                     <w:p>
                       <w:pPr>
-                        <w:pStyle w:val="FrameContents"/>
+                        <w:pStyle w:val="FrameContentsuser"/>
                         <w:jc w:val="center"/>
                         <w:rPr>
                           <w:sz w:val="40"/>
@@ -3241,13 +3265,14 @@
                       </w:pPr>
                       <w:r>
                         <w:rPr>
+                          <w:color w:val="000000"/>
                           <w:sz w:val="40"/>
                         </w:rPr>
                       </w:r>
                     </w:p>
                     <w:p>
                       <w:pPr>
-                        <w:pStyle w:val="FrameContents"/>
+                        <w:pStyle w:val="FrameContentsuser"/>
                         <w:jc w:val="center"/>
                         <w:rPr>
                           <w:sz w:val="40"/>
@@ -3255,13 +3280,14 @@
                       </w:pPr>
                       <w:r>
                         <w:rPr>
+                          <w:color w:val="000000"/>
                           <w:sz w:val="40"/>
                         </w:rPr>
                       </w:r>
                     </w:p>
                     <w:p>
                       <w:pPr>
-                        <w:pStyle w:val="FrameContents"/>
+                        <w:pStyle w:val="FrameContentsuser"/>
                         <w:jc w:val="center"/>
                         <w:rPr>
                           <w:sz w:val="40"/>
@@ -3269,13 +3295,14 @@
                       </w:pPr>
                       <w:r>
                         <w:rPr>
+                          <w:color w:val="000000"/>
                           <w:sz w:val="40"/>
                         </w:rPr>
                       </w:r>
                     </w:p>
                     <w:p>
                       <w:pPr>
-                        <w:pStyle w:val="FrameContents"/>
+                        <w:pStyle w:val="FrameContentsuser"/>
                         <w:jc w:val="center"/>
                         <w:rPr>
                           <w:sz w:val="40"/>
@@ -3283,13 +3310,14 @@
                       </w:pPr>
                       <w:r>
                         <w:rPr>
+                          <w:color w:val="000000"/>
                           <w:sz w:val="40"/>
                         </w:rPr>
                       </w:r>
                     </w:p>
                     <w:p>
                       <w:pPr>
-                        <w:pStyle w:val="FrameContents"/>
+                        <w:pStyle w:val="FrameContentsuser"/>
                         <w:jc w:val="center"/>
                         <w:rPr>
                           <w:sz w:val="40"/>
@@ -3297,13 +3325,14 @@
                       </w:pPr>
                       <w:r>
                         <w:rPr>
+                          <w:color w:val="000000"/>
                           <w:sz w:val="40"/>
                         </w:rPr>
                       </w:r>
                     </w:p>
                     <w:p>
                       <w:pPr>
-                        <w:pStyle w:val="FrameContents"/>
+                        <w:pStyle w:val="FrameContentsuser"/>
                         <w:jc w:val="center"/>
                         <w:rPr>
                           <w:sz w:val="40"/>
@@ -3311,13 +3340,14 @@
                       </w:pPr>
                       <w:r>
                         <w:rPr>
+                          <w:color w:val="000000"/>
                           <w:sz w:val="40"/>
                         </w:rPr>
                       </w:r>
                     </w:p>
                     <w:p>
                       <w:pPr>
-                        <w:pStyle w:val="FrameContents"/>
+                        <w:pStyle w:val="FrameContentsuser"/>
                         <w:jc w:val="center"/>
                         <w:rPr>
                           <w:sz w:val="40"/>
@@ -3325,13 +3355,14 @@
                       </w:pPr>
                       <w:r>
                         <w:rPr>
+                          <w:color w:val="000000"/>
                           <w:sz w:val="40"/>
                         </w:rPr>
                       </w:r>
                     </w:p>
                     <w:p>
                       <w:pPr>
-                        <w:pStyle w:val="FrameContents"/>
+                        <w:pStyle w:val="FrameContentsuser"/>
                         <w:jc w:val="center"/>
                         <w:rPr>
                           <w:sz w:val="40"/>
@@ -3339,13 +3370,14 @@
                       </w:pPr>
                       <w:r>
                         <w:rPr>
+                          <w:color w:val="000000"/>
                           <w:sz w:val="40"/>
                         </w:rPr>
                       </w:r>
                     </w:p>
                     <w:p>
                       <w:pPr>
-                        <w:pStyle w:val="FrameContents"/>
+                        <w:pStyle w:val="FrameContentsuser"/>
                         <w:jc w:val="center"/>
                         <w:rPr>
                           <w:sz w:val="40"/>
@@ -3353,13 +3385,14 @@
                       </w:pPr>
                       <w:r>
                         <w:rPr>
+                          <w:color w:val="000000"/>
                           <w:sz w:val="40"/>
                         </w:rPr>
                       </w:r>
                     </w:p>
                     <w:p>
                       <w:pPr>
-                        <w:pStyle w:val="FrameContents"/>
+                        <w:pStyle w:val="FrameContentsuser"/>
                         <w:jc w:val="center"/>
                         <w:rPr>
                           <w:sz w:val="40"/>
@@ -3367,13 +3400,14 @@
                       </w:pPr>
                       <w:r>
                         <w:rPr>
+                          <w:color w:val="000000"/>
                           <w:sz w:val="40"/>
                         </w:rPr>
                       </w:r>
                     </w:p>
                     <w:p>
                       <w:pPr>
-                        <w:pStyle w:val="FrameContents"/>
+                        <w:pStyle w:val="FrameContentsuser"/>
                         <w:jc w:val="center"/>
                         <w:rPr>
                           <w:sz w:val="40"/>
@@ -3381,13 +3415,14 @@
                       </w:pPr>
                       <w:r>
                         <w:rPr>
+                          <w:color w:val="000000"/>
                           <w:sz w:val="40"/>
                         </w:rPr>
                       </w:r>
                     </w:p>
                     <w:p>
                       <w:pPr>
-                        <w:pStyle w:val="FrameContents"/>
+                        <w:pStyle w:val="FrameContentsuser"/>
                         <w:jc w:val="center"/>
                         <w:rPr>
                           <w:sz w:val="40"/>
@@ -3395,13 +3430,14 @@
                       </w:pPr>
                       <w:r>
                         <w:rPr>
+                          <w:color w:val="000000"/>
                           <w:sz w:val="40"/>
                         </w:rPr>
                       </w:r>
                     </w:p>
                     <w:p>
                       <w:pPr>
-                        <w:pStyle w:val="FrameContents"/>
+                        <w:pStyle w:val="FrameContentsuser"/>
                         <w:jc w:val="center"/>
                         <w:rPr>
                           <w:sz w:val="40"/>
@@ -3409,13 +3445,14 @@
                       </w:pPr>
                       <w:r>
                         <w:rPr>
+                          <w:color w:val="000000"/>
                           <w:sz w:val="40"/>
                         </w:rPr>
                       </w:r>
                     </w:p>
                     <w:p>
                       <w:pPr>
-                        <w:pStyle w:val="FrameContents"/>
+                        <w:pStyle w:val="FrameContentsuser"/>
                         <w:jc w:val="center"/>
                         <w:rPr>
                           <w:sz w:val="40"/>
@@ -3423,13 +3460,14 @@
                       </w:pPr>
                       <w:r>
                         <w:rPr>
+                          <w:color w:val="000000"/>
                           <w:sz w:val="40"/>
                         </w:rPr>
                       </w:r>
                     </w:p>
                     <w:p>
                       <w:pPr>
-                        <w:pStyle w:val="FrameContents"/>
+                        <w:pStyle w:val="FrameContentsuser"/>
                         <w:jc w:val="center"/>
                         <w:rPr>
                           <w:sz w:val="40"/>
@@ -3437,13 +3475,14 @@
                       </w:pPr>
                       <w:r>
                         <w:rPr>
+                          <w:color w:val="000000"/>
                           <w:sz w:val="40"/>
                         </w:rPr>
                       </w:r>
                     </w:p>
                     <w:p>
                       <w:pPr>
-                        <w:pStyle w:val="FrameContents"/>
+                        <w:pStyle w:val="FrameContentsuser"/>
                         <w:jc w:val="center"/>
                         <w:rPr>
                           <w:sz w:val="40"/>
@@ -3451,13 +3490,14 @@
                       </w:pPr>
                       <w:r>
                         <w:rPr>
+                          <w:color w:val="000000"/>
                           <w:sz w:val="40"/>
                         </w:rPr>
                       </w:r>
                     </w:p>
                     <w:p>
                       <w:pPr>
-                        <w:pStyle w:val="FrameContents"/>
+                        <w:pStyle w:val="FrameContentsuser"/>
                         <w:jc w:val="center"/>
                         <w:rPr>
                           <w:sz w:val="40"/>
@@ -3465,20 +3505,23 @@
                       </w:pPr>
                       <w:r>
                         <w:rPr>
+                          <w:color w:val="000000"/>
                           <w:sz w:val="40"/>
                         </w:rPr>
                       </w:r>
                     </w:p>
                     <w:p>
                       <w:pPr>
-                        <w:pStyle w:val="FrameContents"/>
+                        <w:pStyle w:val="FrameContentsuser"/>
                         <w:jc w:val="center"/>
                         <w:rPr>
                           <w:sz w:val="40"/>
                         </w:rPr>
                       </w:pPr>
                       <w:r>
-                        <w:rPr/>
+                        <w:rPr>
+                          <w:color w:val="000000"/>
+                        </w:rPr>
                       </w:r>
                     </w:p>
                   </w:txbxContent>
@@ -3492,7 +3535,7 @@
     </w:p>
     <w:p>
       <w:pPr>
-        <w:pStyle w:val="Contents1"/>
+        <w:pStyle w:val="TOC1"/>
         <w:tabs>
           <w:tab w:val="clear" w:pos="800"/>
           <w:tab w:val="right" w:pos="9016" w:leader="dot"/>
@@ -3505,7 +3548,7 @@
     </w:p>
     <w:p>
       <w:pPr>
-        <w:pStyle w:val="Contents1"/>
+        <w:pStyle w:val="TOC1"/>
         <w:tabs>
           <w:tab w:val="clear" w:pos="800"/>
           <w:tab w:val="right" w:pos="9016" w:leader="dot"/>
@@ -3545,12 +3588,12 @@
       <w:sdtContent>
         <w:p>
           <w:pPr>
-            <w:pStyle w:val="ContentsHeading"/>
+            <w:pStyle w:val="TOCHeading"/>
             <w:numPr>
               <w:ilvl w:val="0"/>
               <w:numId w:val="0"/>
             </w:numPr>
-            <w:ind w:left="800" w:hanging="400"/>
+            <w:ind w:hanging="400" w:left="800"/>
             <w:rPr/>
           </w:pPr>
           <w:r>
@@ -3559,7 +3602,7 @@
         </w:p>
         <w:p>
           <w:pPr>
-            <w:pStyle w:val="Contents1"/>
+            <w:pStyle w:val="TOC1"/>
             <w:tabs>
               <w:tab w:val="clear" w:pos="800"/>
               <w:tab w:val="right" w:pos="9016" w:leader="dot"/>
@@ -3641,12 +3684,12 @@
         </w:p>
         <w:p>
           <w:pPr>
-            <w:pStyle w:val="Contents2"/>
+            <w:pStyle w:val="TOC2"/>
             <w:tabs>
               <w:tab w:val="clear" w:pos="800"/>
               <w:tab w:val="right" w:pos="9016" w:leader="dot"/>
             </w:tabs>
-            <w:ind w:left="400" w:hanging="0"/>
+            <w:ind w:hanging="0" w:left="400"/>
             <w:rPr/>
           </w:pPr>
           <w:hyperlink w:anchor="_Toc219208419">
@@ -3703,12 +3746,12 @@
         </w:p>
         <w:p>
           <w:pPr>
-            <w:pStyle w:val="Contents2"/>
+            <w:pStyle w:val="TOC2"/>
             <w:tabs>
               <w:tab w:val="clear" w:pos="800"/>
               <w:tab w:val="right" w:pos="9016" w:leader="dot"/>
             </w:tabs>
-            <w:ind w:left="400" w:hanging="0"/>
+            <w:ind w:hanging="0" w:left="400"/>
             <w:rPr/>
           </w:pPr>
           <w:hyperlink w:anchor="_Toc219208420">
@@ -3799,12 +3842,12 @@
         </w:p>
         <w:p>
           <w:pPr>
-            <w:pStyle w:val="Contents2"/>
+            <w:pStyle w:val="TOC2"/>
             <w:tabs>
               <w:tab w:val="clear" w:pos="800"/>
               <w:tab w:val="right" w:pos="9016" w:leader="dot"/>
             </w:tabs>
-            <w:ind w:left="400" w:hanging="0"/>
+            <w:ind w:hanging="0" w:left="400"/>
             <w:rPr/>
           </w:pPr>
           <w:hyperlink w:anchor="_Toc219208421">
@@ -3861,12 +3904,12 @@
         </w:p>
         <w:p>
           <w:pPr>
-            <w:pStyle w:val="Contents2"/>
+            <w:pStyle w:val="TOC2"/>
             <w:tabs>
               <w:tab w:val="clear" w:pos="800"/>
               <w:tab w:val="right" w:pos="9016" w:leader="dot"/>
             </w:tabs>
-            <w:ind w:left="400" w:hanging="0"/>
+            <w:ind w:hanging="0" w:left="400"/>
             <w:rPr/>
           </w:pPr>
           <w:hyperlink w:anchor="_Toc219208422">
@@ -3923,7 +3966,7 @@
         </w:p>
         <w:p>
           <w:pPr>
-            <w:pStyle w:val="Contents1"/>
+            <w:pStyle w:val="TOC1"/>
             <w:tabs>
               <w:tab w:val="clear" w:pos="800"/>
               <w:tab w:val="right" w:pos="9016" w:leader="dot"/>
@@ -4054,12 +4097,12 @@
         </w:p>
         <w:p>
           <w:pPr>
-            <w:pStyle w:val="Contents2"/>
+            <w:pStyle w:val="TOC2"/>
             <w:tabs>
               <w:tab w:val="clear" w:pos="800"/>
               <w:tab w:val="right" w:pos="9016" w:leader="dot"/>
             </w:tabs>
-            <w:ind w:left="400" w:hanging="0"/>
+            <w:ind w:hanging="0" w:left="400"/>
             <w:rPr/>
           </w:pPr>
           <w:hyperlink w:anchor="_Toc219208424">
@@ -4116,12 +4159,12 @@
         </w:p>
         <w:p>
           <w:pPr>
-            <w:pStyle w:val="Contents2"/>
+            <w:pStyle w:val="TOC2"/>
             <w:tabs>
               <w:tab w:val="clear" w:pos="800"/>
               <w:tab w:val="right" w:pos="9016" w:leader="dot"/>
             </w:tabs>
-            <w:ind w:left="400" w:hanging="0"/>
+            <w:ind w:hanging="0" w:left="400"/>
             <w:rPr/>
           </w:pPr>
           <w:hyperlink w:anchor="_Toc219208425">
@@ -4178,7 +4221,7 @@
         </w:p>
         <w:p>
           <w:pPr>
-            <w:pStyle w:val="Contents1"/>
+            <w:pStyle w:val="TOC1"/>
             <w:tabs>
               <w:tab w:val="clear" w:pos="800"/>
               <w:tab w:val="right" w:pos="9016" w:leader="dot"/>
@@ -4239,12 +4282,12 @@
         </w:p>
         <w:p>
           <w:pPr>
-            <w:pStyle w:val="Contents2"/>
+            <w:pStyle w:val="TOC2"/>
             <w:tabs>
               <w:tab w:val="clear" w:pos="800"/>
               <w:tab w:val="right" w:pos="9016" w:leader="dot"/>
             </w:tabs>
-            <w:ind w:left="400" w:hanging="0"/>
+            <w:ind w:hanging="0" w:left="400"/>
             <w:rPr/>
           </w:pPr>
           <w:hyperlink w:anchor="_Toc219208427">
@@ -4300,12 +4343,12 @@
         </w:p>
         <w:p>
           <w:pPr>
-            <w:pStyle w:val="Contents2"/>
+            <w:pStyle w:val="TOC2"/>
             <w:tabs>
               <w:tab w:val="clear" w:pos="800"/>
               <w:tab w:val="right" w:pos="9016" w:leader="dot"/>
             </w:tabs>
-            <w:ind w:left="400" w:hanging="0"/>
+            <w:ind w:hanging="0" w:left="400"/>
             <w:rPr/>
           </w:pPr>
           <w:hyperlink w:anchor="_Toc219208428">
@@ -4396,12 +4439,12 @@
         </w:p>
         <w:p>
           <w:pPr>
-            <w:pStyle w:val="Contents2"/>
+            <w:pStyle w:val="TOC2"/>
             <w:tabs>
               <w:tab w:val="clear" w:pos="800"/>
               <w:tab w:val="right" w:pos="9016" w:leader="dot"/>
             </w:tabs>
-            <w:ind w:left="400" w:hanging="0"/>
+            <w:ind w:hanging="0" w:left="400"/>
             <w:rPr/>
           </w:pPr>
           <w:hyperlink w:anchor="_Toc219208429">
@@ -4492,7 +4535,7 @@
         </w:p>
         <w:p>
           <w:pPr>
-            <w:pStyle w:val="Contents1"/>
+            <w:pStyle w:val="TOC1"/>
             <w:tabs>
               <w:tab w:val="clear" w:pos="800"/>
               <w:tab w:val="right" w:pos="9016" w:leader="dot"/>
@@ -4553,12 +4596,12 @@
         </w:p>
         <w:p>
           <w:pPr>
-            <w:pStyle w:val="Contents2"/>
+            <w:pStyle w:val="TOC2"/>
             <w:tabs>
               <w:tab w:val="clear" w:pos="800"/>
               <w:tab w:val="right" w:pos="9016" w:leader="dot"/>
             </w:tabs>
-            <w:ind w:left="400" w:hanging="0"/>
+            <w:ind w:hanging="0" w:left="400"/>
             <w:rPr/>
           </w:pPr>
           <w:hyperlink w:anchor="_Toc219208431">
@@ -4614,12 +4657,12 @@
         </w:p>
         <w:p>
           <w:pPr>
-            <w:pStyle w:val="Contents2"/>
+            <w:pStyle w:val="TOC2"/>
             <w:tabs>
               <w:tab w:val="clear" w:pos="800"/>
               <w:tab w:val="right" w:pos="9016" w:leader="dot"/>
             </w:tabs>
-            <w:ind w:left="400" w:hanging="0"/>
+            <w:ind w:hanging="0" w:left="400"/>
             <w:rPr/>
           </w:pPr>
           <w:hyperlink w:anchor="_Toc219208432">
@@ -4731,7 +4774,8 @@
           <w:ilvl w:val="0"/>
           <w:numId w:val="0"/>
         </w:numPr>
-        <w:ind w:left="0" w:firstLine="300"/>
+        <w:spacing w:before="0" w:after="0"/>
+        <w:ind w:firstLine="300" w:left="0"/>
         <w:rPr>
           <w:rFonts w:ascii="맑은 고딕" w:hAnsi="맑은 고딕" w:eastAsia="맑은 고딕" w:asciiTheme="majorHAnsi" w:eastAsiaTheme="majorHAnsi" w:hAnsiTheme="majorHAnsi"/>
           <w:sz w:val="20"/>
@@ -4789,7 +4833,6 @@
         <w:pStyle w:val="Normal"/>
         <w:jc w:val="both"/>
         <w:rPr>
-          <w:b/>
           <w:b/>
           <w:bCs/>
           <w:color w:val="C9211E"/>
@@ -4954,7 +4997,23 @@
           <w:color w:val="C9211E"/>
           <w:szCs w:val="20"/>
         </w:rPr>
-        <w:t>//1.1 d. Move the downloaded model to “/tmp/models/” and make sure that the folder is read and writable by changing from root ownership</w:t>
+        <w:t xml:space="preserve">//1.1 </w:t>
+      </w:r>
+      <w:r>
+        <w:rPr>
+          <w:rFonts w:eastAsia="맑은 고딕" w:eastAsiaTheme="majorHAnsi"/>
+          <w:color w:val="C9211E"/>
+          <w:szCs w:val="20"/>
+        </w:rPr>
+        <w:t>e</w:t>
+      </w:r>
+      <w:r>
+        <w:rPr>
+          <w:rFonts w:eastAsia="맑은 고딕" w:eastAsiaTheme="majorHAnsi"/>
+          <w:color w:val="C9211E"/>
+          <w:szCs w:val="20"/>
+        </w:rPr>
+        <w:t>. Move the downloaded model to “/tmp/models/” and make sure that the folder is read and writable by changing from root ownership</w:t>
       </w:r>
     </w:p>
     <w:p>
@@ -5372,7 +5431,8 @@
           <w:ilvl w:val="0"/>
           <w:numId w:val="0"/>
         </w:numPr>
-        <w:ind w:left="400" w:hanging="0"/>
+        <w:spacing w:before="0" w:after="0"/>
+        <w:ind w:hanging="0" w:left="400"/>
         <w:rPr>
           <w:rFonts w:ascii="맑은 고딕" w:hAnsi="맑은 고딕" w:eastAsia="맑은 고딕" w:asciiTheme="majorHAnsi" w:eastAsiaTheme="majorHAnsi" w:hAnsiTheme="majorHAnsi"/>
           <w:sz w:val="20"/>
@@ -5431,7 +5491,7 @@
           <wp:inline distT="0" distB="0" distL="0" distR="0">
             <wp:extent cx="3250565" cy="2329815"/>
             <wp:effectExtent l="0" t="0" r="0" b="0"/>
-            <wp:docPr id="3" name="그림 1" descr=""/>
+            <wp:docPr id="2" name="그림 1" descr=""/>
             <wp:cNvGraphicFramePr>
               <a:graphicFrameLocks xmlns:a="http://schemas.openxmlformats.org/drawingml/2006/main" noChangeAspect="1"/>
             </wp:cNvGraphicFramePr>
@@ -5439,7 +5499,7 @@
               <a:graphicData uri="http://schemas.openxmlformats.org/drawingml/2006/picture">
                 <pic:pic xmlns:pic="http://schemas.openxmlformats.org/drawingml/2006/picture">
                   <pic:nvPicPr>
-                    <pic:cNvPr id="3" name="그림 1" descr=""/>
+                    <pic:cNvPr id="2" name="그림 1" descr=""/>
                     <pic:cNvPicPr>
                       <a:picLocks noChangeAspect="1" noChangeArrowheads="1"/>
                     </pic:cNvPicPr>
@@ -5458,6 +5518,7 @@
                     <a:prstGeom prst="rect">
                       <a:avLst/>
                     </a:prstGeom>
+                    <a:noFill/>
                   </pic:spPr>
                 </pic:pic>
               </a:graphicData>
@@ -6061,7 +6122,8 @@
           <w:ilvl w:val="0"/>
           <w:numId w:val="0"/>
         </w:numPr>
-        <w:ind w:left="400" w:hanging="0"/>
+        <w:spacing w:before="0" w:after="0"/>
+        <w:ind w:hanging="0" w:left="400"/>
         <w:rPr>
           <w:rFonts w:ascii="맑은 고딕" w:hAnsi="맑은 고딕" w:eastAsia="맑은 고딕" w:asciiTheme="minorEastAsia" w:eastAsiaTheme="minorEastAsia" w:hAnsiTheme="minorEastAsia"/>
           <w:sz w:val="20"/>
@@ -6453,7 +6515,7 @@
             <w:pPr>
               <w:pStyle w:val="Normal"/>
               <w:widowControl w:val="false"/>
-              <w:ind w:left="100" w:hanging="100"/>
+              <w:ind w:hanging="100" w:left="100"/>
               <w:rPr/>
             </w:pPr>
             <w:r>
@@ -6465,7 +6527,7 @@
             <w:pPr>
               <w:pStyle w:val="Normal"/>
               <w:widowControl w:val="false"/>
-              <w:ind w:left="100" w:hanging="100"/>
+              <w:ind w:hanging="100" w:left="100"/>
               <w:rPr/>
             </w:pPr>
             <w:r>
@@ -8036,7 +8098,8 @@
           <w:ilvl w:val="0"/>
           <w:numId w:val="0"/>
         </w:numPr>
-        <w:ind w:left="400" w:hanging="0"/>
+        <w:spacing w:before="0" w:after="0"/>
+        <w:ind w:hanging="0" w:left="400"/>
         <w:rPr>
           <w:rFonts w:ascii="맑은 고딕" w:hAnsi="맑은 고딕" w:eastAsia="맑은 고딕" w:asciiTheme="minorEastAsia" w:eastAsiaTheme="minorEastAsia" w:hAnsiTheme="minorEastAsia"/>
           <w:sz w:val="20"/>
@@ -8407,124 +8470,112 @@
         <w:rPr>
           <w:color w:val="00A933"/>
         </w:rPr>
-        <w:t xml:space="preserve">This should have been done beforehand (i.e. before attempting to docker connect to server). </w:t>
-      </w:r>
-      <w:r>
+        <w:t>This should have been done beforehand (i.e. before attempting to docker connect to server). It should be copies into “</w:t>
+      </w:r>
+      <w:r>
+        <w:rPr/>
+        <w:t>/tmp/model”</w:t>
+      </w:r>
+    </w:p>
+    <w:p>
+      <w:pPr>
+        <w:pStyle w:val="Normal"/>
+        <w:rPr/>
+      </w:pPr>
+      <w:r>
+        <w:rPr/>
+        <w:t>sd-v1-1.safetensors</w:t>
+      </w:r>
+    </w:p>
+    <w:p>
+      <w:pPr>
+        <w:pStyle w:val="Normal"/>
+        <w:rPr/>
+      </w:pPr>
+      <w:r>
+        <w:rPr/>
+        <w:t>sd-v1-2.safetensors</w:t>
+      </w:r>
+    </w:p>
+    <w:p>
+      <w:pPr>
+        <w:pStyle w:val="Normal"/>
+        <w:rPr/>
+      </w:pPr>
+      <w:r>
+        <w:rPr/>
+        <w:t xml:space="preserve">sd-v1-4.safetensors </w:t>
+      </w:r>
+      <w:r>
+        <w:rPr>
+          <w:color w:val="FF0000"/>
+        </w:rPr>
+        <w:t xml:space="preserve">//downloading using: </w:t>
+      </w:r>
+      <w:r>
+        <w:rPr>
+          <w:color w:val="2A6099"/>
+        </w:rPr>
+        <w:t>wget -U mozilla "https://huggingface.co/CompVis/stable-diffusion-v-1-4-original/resolve/c0472cb37716f921bae3d58f9d07ef36a2b2b2bb/sd-v1-4.safetensors”</w:t>
+      </w:r>
+    </w:p>
+    <w:p>
+      <w:pPr>
+        <w:pStyle w:val="Normal"/>
+        <w:rPr/>
+      </w:pPr>
+      <w:r>
+        <w:rPr/>
+      </w:r>
+    </w:p>
+    <w:p>
+      <w:pPr>
+        <w:pStyle w:val="Normal"/>
+        <w:rPr>
+          <w:color w:val="000000"/>
+        </w:rPr>
+      </w:pPr>
+      <w:r>
+        <w:rPr>
+          <w:color w:val="000000"/>
+        </w:rPr>
+        <w:t>v1-5-pruned-emaonly.safetensors</w:t>
+      </w:r>
+    </w:p>
+    <w:p>
+      <w:pPr>
+        <w:pStyle w:val="Normal"/>
+        <w:rPr>
+          <w:color w:val="000000"/>
+        </w:rPr>
+      </w:pPr>
+      <w:r>
+        <w:rPr>
+          <w:color w:val="000000"/>
+        </w:rPr>
+      </w:r>
+    </w:p>
+    <w:p>
+      <w:pPr>
+        <w:pStyle w:val="Normal"/>
+        <w:rPr/>
+      </w:pPr>
+      <w:r>
+        <w:rPr/>
+      </w:r>
+    </w:p>
+    <w:p>
+      <w:pPr>
+        <w:pStyle w:val="Normal"/>
         <w:rPr>
           <w:color w:val="00A933"/>
         </w:rPr>
-        <w:t>It should be copies into “</w:t>
-      </w:r>
-      <w:r>
-        <w:rPr/>
-        <w:t>/tmp/model”</w:t>
-      </w:r>
-    </w:p>
-    <w:p>
-      <w:pPr>
-        <w:pStyle w:val="Normal"/>
-        <w:rPr/>
-      </w:pPr>
-      <w:r>
-        <w:rPr/>
-        <w:t>sd-v1-1.safetensors</w:t>
-      </w:r>
-    </w:p>
-    <w:p>
-      <w:pPr>
-        <w:pStyle w:val="Normal"/>
-        <w:rPr/>
-      </w:pPr>
-      <w:r>
-        <w:rPr/>
-        <w:t>sd-v1-2.safetensors</w:t>
-      </w:r>
-    </w:p>
-    <w:p>
-      <w:pPr>
-        <w:pStyle w:val="Normal"/>
-        <w:rPr/>
-      </w:pPr>
-      <w:r>
-        <w:rPr/>
-        <w:t xml:space="preserve">sd-v1-4.safetensors </w:t>
-      </w:r>
-      <w:r>
-        <w:rPr>
-          <w:color w:val="FF0000"/>
-        </w:rPr>
-        <w:t xml:space="preserve">//downloading using: </w:t>
-      </w:r>
-      <w:r>
-        <w:rPr>
-          <w:color w:val="2A6099"/>
-        </w:rPr>
-        <w:t>wget -U mozilla "https://huggingface.co/CompVis/stable-diffusion-v-1-4-original/resolve/c0472cb37716f921bae3d58f9d07ef36a2b2b2bb/sd-v1-4.safetensors”</w:t>
-      </w:r>
-    </w:p>
-    <w:p>
-      <w:pPr>
-        <w:pStyle w:val="Normal"/>
-        <w:rPr/>
-      </w:pPr>
-      <w:r>
-        <w:rPr/>
-      </w:r>
-    </w:p>
-    <w:p>
-      <w:pPr>
-        <w:pStyle w:val="Normal"/>
-        <w:rPr>
-          <w:color w:val="000000"/>
-        </w:rPr>
-      </w:pPr>
-      <w:r>
-        <w:rPr>
-          <w:color w:val="000000"/>
-        </w:rPr>
-        <w:t>v1-5-pruned-emaonly.safetensors</w:t>
-      </w:r>
-    </w:p>
-    <w:p>
-      <w:pPr>
-        <w:pStyle w:val="Normal"/>
-        <w:rPr>
-          <w:color w:val="000000"/>
-        </w:rPr>
-      </w:pPr>
-      <w:r>
-        <w:rPr/>
-      </w:r>
-    </w:p>
-    <w:p>
-      <w:pPr>
-        <w:pStyle w:val="Normal"/>
-        <w:rPr/>
       </w:pPr>
       <w:r>
         <w:rPr>
           <w:color w:val="00A933"/>
         </w:rPr>
-      </w:r>
-    </w:p>
-    <w:p>
-      <w:pPr>
-        <w:pStyle w:val="Normal"/>
-        <w:rPr>
-          <w:color w:val="00A933"/>
-        </w:rPr>
-      </w:pPr>
-      <w:r>
-        <w:rPr>
-          <w:color w:val="00A933"/>
-        </w:rPr>
-        <w:t xml:space="preserve">// </w:t>
-      </w:r>
-      <w:r>
-        <w:rPr>
-          <w:color w:val="00A933"/>
-        </w:rPr>
-        <w:t xml:space="preserve">Dont forget to copy ‘real_stats.npz’ into </w:t>
+        <w:t xml:space="preserve">// Dont forget to copy ‘real_stats.npz’ into </w:t>
       </w:r>
       <w:r>
         <w:rPr>
@@ -8559,14 +8610,15 @@
         </w:rPr>
       </w:pPr>
       <w:r>
-        <w:rPr/>
-      </w:r>
-    </w:p>
-    <w:p>
-      <w:pPr>
-        <w:pStyle w:val="Normal"/>
-        <w:rPr>
-          <w:b/>
+        <w:rPr>
+          <w:color w:val="000000"/>
+        </w:rPr>
+      </w:r>
+    </w:p>
+    <w:p>
+      <w:pPr>
+        <w:pStyle w:val="Normal"/>
+        <w:rPr>
           <w:b/>
           <w:bCs/>
           <w:color w:val="FF0000"/>
@@ -8692,6 +8744,7 @@
     <w:p>
       <w:pPr>
         <w:pStyle w:val="Heading2"/>
+        <w:spacing w:before="0" w:after="0"/>
         <w:rPr/>
       </w:pPr>
       <w:bookmarkStart w:id="14" w:name="_Toc219208432"/>
@@ -8992,14 +9045,186 @@
         <w:pStyle w:val="Normal"/>
         <w:rPr>
           <w:b/>
+        </w:rPr>
+      </w:pPr>
+      <w:r>
+        <w:rPr>
           <w:b/>
         </w:rPr>
-      </w:pPr>
-      <w:r>
+        <w:t>address_port.json</w:t>
+      </w:r>
+    </w:p>
+    <w:p>
+      <w:pPr>
+        <w:pStyle w:val="Normal"/>
+        <w:rPr/>
+      </w:pPr>
+      <w:r>
+        <w:rPr/>
+        <w:t>[</w:t>
+      </w:r>
+    </w:p>
+    <w:p>
+      <w:pPr>
+        <w:pStyle w:val="Normal"/>
+        <w:rPr/>
+      </w:pPr>
+      <w:r>
+        <w:rPr/>
+        <w:t>{</w:t>
+      </w:r>
+    </w:p>
+    <w:p>
+      <w:pPr>
+        <w:pStyle w:val="Normal"/>
+        <w:rPr/>
+      </w:pPr>
+      <w:r>
+        <w:rPr/>
+        <w:t>"id": 1,</w:t>
+      </w:r>
+    </w:p>
+    <w:p>
+      <w:pPr>
+        <w:pStyle w:val="Normal"/>
+        <w:rPr/>
+      </w:pPr>
+      <w:r>
+        <w:rPr/>
+        <w:t>"address": "localhost:50010"</w:t>
+      </w:r>
+    </w:p>
+    <w:p>
+      <w:pPr>
+        <w:pStyle w:val="Normal"/>
+        <w:rPr/>
+      </w:pPr>
+      <w:r>
+        <w:rPr/>
+        <w:t>},</w:t>
+      </w:r>
+    </w:p>
+    <w:p>
+      <w:pPr>
+        <w:pStyle w:val="Normal"/>
+        <w:rPr/>
+      </w:pPr>
+      <w:r>
+        <w:rPr/>
+        <w:t>{</w:t>
+      </w:r>
+    </w:p>
+    <w:p>
+      <w:pPr>
+        <w:pStyle w:val="Normal"/>
+        <w:rPr/>
+      </w:pPr>
+      <w:r>
+        <w:rPr/>
+        <w:t>"id": 2,</w:t>
+      </w:r>
+    </w:p>
+    <w:p>
+      <w:pPr>
+        <w:pStyle w:val="Normal"/>
+        <w:rPr/>
+      </w:pPr>
+      <w:r>
+        <w:rPr/>
+        <w:t>"address": "localhost:50020"</w:t>
+      </w:r>
+    </w:p>
+    <w:p>
+      <w:pPr>
+        <w:pStyle w:val="Normal"/>
+        <w:rPr/>
+      </w:pPr>
+      <w:r>
+        <w:rPr/>
+        <w:t>},</w:t>
+      </w:r>
+    </w:p>
+    <w:p>
+      <w:pPr>
+        <w:pStyle w:val="Normal"/>
+        <w:rPr/>
+      </w:pPr>
+      <w:r>
+        <w:rPr/>
+        <w:t>{</w:t>
+      </w:r>
+    </w:p>
+    <w:p>
+      <w:pPr>
+        <w:pStyle w:val="Normal"/>
+        <w:rPr/>
+      </w:pPr>
+      <w:r>
+        <w:rPr/>
+        <w:t>"id": 3,</w:t>
+      </w:r>
+    </w:p>
+    <w:p>
+      <w:pPr>
+        <w:pStyle w:val="Normal"/>
+        <w:rPr/>
+      </w:pPr>
+      <w:r>
+        <w:rPr/>
+        <w:t>"address": "localhost:50060"</w:t>
+      </w:r>
+    </w:p>
+    <w:p>
+      <w:pPr>
+        <w:pStyle w:val="Normal"/>
+        <w:rPr/>
+      </w:pPr>
+      <w:r>
+        <w:rPr/>
+        <w:t>}</w:t>
+      </w:r>
+    </w:p>
+    <w:p>
+      <w:pPr>
+        <w:pStyle w:val="Normal"/>
+        <w:rPr/>
+      </w:pPr>
+      <w:r>
+        <w:rPr/>
+        <w:t>]</w:t>
+      </w:r>
+    </w:p>
+    <w:p>
+      <w:pPr>
+        <w:pStyle w:val="Normal"/>
+        <w:rPr/>
+      </w:pPr>
+      <w:r>
+        <w:rPr/>
+      </w:r>
+    </w:p>
+    <w:p>
+      <w:pPr>
+        <w:pStyle w:val="Normal"/>
+        <w:rPr/>
+      </w:pPr>
+      <w:r>
+        <w:rPr/>
+        <w:t>-sampler 3</w:t>
+      </w:r>
+    </w:p>
+    <w:p>
+      <w:pPr>
+        <w:pStyle w:val="Normal"/>
         <w:rPr>
           <w:b/>
         </w:rPr>
-        <w:t>address_port.json</w:t>
+      </w:pPr>
+      <w:r>
+        <w:rPr>
+          <w:b/>
+        </w:rPr>
+        <w:t>samplers.json</w:t>
       </w:r>
     </w:p>
     <w:p>
@@ -9039,7 +9264,7 @@
       </w:pPr>
       <w:r>
         <w:rPr/>
-        <w:t>"address": "localhost:50010"</w:t>
+        <w:t>"filename": "Euler_a"</w:t>
       </w:r>
     </w:p>
     <w:p>
@@ -9079,7 +9304,7 @@
       </w:pPr>
       <w:r>
         <w:rPr/>
-        <w:t>"address": "localhost:50020"</w:t>
+        <w:t>"filename": "DPM++_Karras"</w:t>
       </w:r>
     </w:p>
     <w:p>
@@ -9119,7 +9344,47 @@
       </w:pPr>
       <w:r>
         <w:rPr/>
-        <w:t>"address": "localhost:50060"</w:t>
+        <w:t>"filename": "LMS"</w:t>
+      </w:r>
+    </w:p>
+    <w:p>
+      <w:pPr>
+        <w:pStyle w:val="Normal"/>
+        <w:rPr/>
+      </w:pPr>
+      <w:r>
+        <w:rPr/>
+        <w:t>},</w:t>
+      </w:r>
+    </w:p>
+    <w:p>
+      <w:pPr>
+        <w:pStyle w:val="Normal"/>
+        <w:rPr/>
+      </w:pPr>
+      <w:r>
+        <w:rPr/>
+        <w:t>{</w:t>
+      </w:r>
+    </w:p>
+    <w:p>
+      <w:pPr>
+        <w:pStyle w:val="Normal"/>
+        <w:rPr/>
+      </w:pPr>
+      <w:r>
+        <w:rPr/>
+        <w:t>"id": 4,</w:t>
+      </w:r>
+    </w:p>
+    <w:p>
+      <w:pPr>
+        <w:pStyle w:val="Normal"/>
+        <w:rPr/>
+      </w:pPr>
+      <w:r>
+        <w:rPr/>
+        <w:t>"filename": "DDIM"</w:t>
       </w:r>
     </w:p>
     <w:p>
@@ -9142,222 +9407,10 @@
         <w:t>]</w:t>
       </w:r>
     </w:p>
-    <w:p>
-      <w:pPr>
-        <w:pStyle w:val="Normal"/>
-        <w:rPr/>
-      </w:pPr>
-      <w:r>
-        <w:rPr/>
-      </w:r>
-    </w:p>
-    <w:p>
-      <w:pPr>
-        <w:pStyle w:val="Normal"/>
-        <w:rPr/>
-      </w:pPr>
-      <w:r>
-        <w:rPr/>
-        <w:t>-sampler 3</w:t>
-      </w:r>
-    </w:p>
-    <w:p>
-      <w:pPr>
-        <w:pStyle w:val="Normal"/>
-        <w:rPr>
-          <w:b/>
-          <w:b/>
-        </w:rPr>
-      </w:pPr>
-      <w:r>
-        <w:rPr>
-          <w:b/>
-        </w:rPr>
-        <w:t>samplers.json</w:t>
-      </w:r>
-    </w:p>
-    <w:p>
-      <w:pPr>
-        <w:pStyle w:val="Normal"/>
-        <w:rPr/>
-      </w:pPr>
-      <w:r>
-        <w:rPr/>
-        <w:t>[</w:t>
-      </w:r>
-    </w:p>
-    <w:p>
-      <w:pPr>
-        <w:pStyle w:val="Normal"/>
-        <w:rPr/>
-      </w:pPr>
-      <w:r>
-        <w:rPr/>
-        <w:t>{</w:t>
-      </w:r>
-    </w:p>
-    <w:p>
-      <w:pPr>
-        <w:pStyle w:val="Normal"/>
-        <w:rPr/>
-      </w:pPr>
-      <w:r>
-        <w:rPr/>
-        <w:t>"id": 1,</w:t>
-      </w:r>
-    </w:p>
-    <w:p>
-      <w:pPr>
-        <w:pStyle w:val="Normal"/>
-        <w:rPr/>
-      </w:pPr>
-      <w:r>
-        <w:rPr/>
-        <w:t>"filename": "Euler_a"</w:t>
-      </w:r>
-    </w:p>
-    <w:p>
-      <w:pPr>
-        <w:pStyle w:val="Normal"/>
-        <w:rPr/>
-      </w:pPr>
-      <w:r>
-        <w:rPr/>
-        <w:t>},</w:t>
-      </w:r>
-    </w:p>
-    <w:p>
-      <w:pPr>
-        <w:pStyle w:val="Normal"/>
-        <w:rPr/>
-      </w:pPr>
-      <w:r>
-        <w:rPr/>
-        <w:t>{</w:t>
-      </w:r>
-    </w:p>
-    <w:p>
-      <w:pPr>
-        <w:pStyle w:val="Normal"/>
-        <w:rPr/>
-      </w:pPr>
-      <w:r>
-        <w:rPr/>
-        <w:t>"id": 2,</w:t>
-      </w:r>
-    </w:p>
-    <w:p>
-      <w:pPr>
-        <w:pStyle w:val="Normal"/>
-        <w:rPr/>
-      </w:pPr>
-      <w:r>
-        <w:rPr/>
-        <w:t>"filename": "DPM++_Karras"</w:t>
-      </w:r>
-    </w:p>
-    <w:p>
-      <w:pPr>
-        <w:pStyle w:val="Normal"/>
-        <w:rPr/>
-      </w:pPr>
-      <w:r>
-        <w:rPr/>
-        <w:t>},</w:t>
-      </w:r>
-    </w:p>
-    <w:p>
-      <w:pPr>
-        <w:pStyle w:val="Normal"/>
-        <w:rPr/>
-      </w:pPr>
-      <w:r>
-        <w:rPr/>
-        <w:t>{</w:t>
-      </w:r>
-    </w:p>
-    <w:p>
-      <w:pPr>
-        <w:pStyle w:val="Normal"/>
-        <w:rPr/>
-      </w:pPr>
-      <w:r>
-        <w:rPr/>
-        <w:t>"id": 3,</w:t>
-      </w:r>
-    </w:p>
-    <w:p>
-      <w:pPr>
-        <w:pStyle w:val="Normal"/>
-        <w:rPr/>
-      </w:pPr>
-      <w:r>
-        <w:rPr/>
-        <w:t>"filename": "LMS"</w:t>
-      </w:r>
-    </w:p>
-    <w:p>
-      <w:pPr>
-        <w:pStyle w:val="Normal"/>
-        <w:rPr/>
-      </w:pPr>
-      <w:r>
-        <w:rPr/>
-        <w:t>},</w:t>
-      </w:r>
-    </w:p>
-    <w:p>
-      <w:pPr>
-        <w:pStyle w:val="Normal"/>
-        <w:rPr/>
-      </w:pPr>
-      <w:r>
-        <w:rPr/>
-        <w:t>{</w:t>
-      </w:r>
-    </w:p>
-    <w:p>
-      <w:pPr>
-        <w:pStyle w:val="Normal"/>
-        <w:rPr/>
-      </w:pPr>
-      <w:r>
-        <w:rPr/>
-        <w:t>"id": 4,</w:t>
-      </w:r>
-    </w:p>
-    <w:p>
-      <w:pPr>
-        <w:pStyle w:val="Normal"/>
-        <w:rPr/>
-      </w:pPr>
-      <w:r>
-        <w:rPr/>
-        <w:t>"filename": "DDIM"</w:t>
-      </w:r>
-    </w:p>
-    <w:p>
-      <w:pPr>
-        <w:pStyle w:val="Normal"/>
-        <w:rPr/>
-      </w:pPr>
-      <w:r>
-        <w:rPr/>
-        <w:t>}</w:t>
-      </w:r>
-    </w:p>
-    <w:p>
-      <w:pPr>
-        <w:pStyle w:val="Normal"/>
-        <w:rPr/>
-      </w:pPr>
-      <w:r>
-        <w:rPr/>
-        <w:t>]</w:t>
-      </w:r>
-    </w:p>
     <w:sectPr>
-      <w:footerReference w:type="default" r:id="rId3"/>
+      <w:footerReference w:type="even" r:id="rId3"/>
+      <w:footerReference w:type="default" r:id="rId4"/>
+      <w:footerReference w:type="first" r:id="rId5"/>
       <w:type w:val="nextPage"/>
       <w:pgSz w:w="11906" w:h="16838"/>
       <w:pgMar w:left="1440" w:right="1440" w:gutter="0" w:header="0" w:top="1701" w:footer="992" w:bottom="1440"/>
@@ -9371,7 +9424,73 @@
 </file>
 
 <file path=word/footer1.xml><?xml version="1.0" encoding="utf-8"?>
-<w:ftr xmlns:o="urn:schemas-microsoft-com:office:office" xmlns:r="http://schemas.openxmlformats.org/officeDocument/2006/relationships" xmlns:v="urn:schemas-microsoft-com:vml" xmlns:w="http://schemas.openxmlformats.org/wordprocessingml/2006/main" xmlns:w10="urn:schemas-microsoft-com:office:word" xmlns:wp="http://schemas.openxmlformats.org/drawingml/2006/wordprocessingDrawing" xmlns:wps="http://schemas.microsoft.com/office/word/2010/wordprocessingShape" xmlns:wpg="http://schemas.microsoft.com/office/word/2010/wordprocessingGroup" xmlns:mc="http://schemas.openxmlformats.org/markup-compatibility/2006" xmlns:wp14="http://schemas.microsoft.com/office/word/2010/wordprocessingDrawing" xmlns:w14="http://schemas.microsoft.com/office/word/2010/wordml" xmlns:w15="http://schemas.microsoft.com/office/word/2012/wordml" mc:Ignorable="w14 wp14 w15">
+<w:ftr xmlns:o="urn:schemas-microsoft-com:office:office" xmlns:r="http://schemas.openxmlformats.org/officeDocument/2006/relationships" xmlns:v="urn:schemas-microsoft-com:vml" xmlns:w="http://schemas.openxmlformats.org/wordprocessingml/2006/main" xmlns:w10="urn:schemas-microsoft-com:office:word" xmlns:wp="http://schemas.openxmlformats.org/drawingml/2006/wordprocessingDrawing" xmlns:pic="http://schemas.openxmlformats.org/drawingml/2006/picture" xmlns:wps="http://schemas.microsoft.com/office/word/2010/wordprocessingShape" xmlns:wpg="http://schemas.microsoft.com/office/word/2010/wordprocessingGroup" xmlns:mc="http://schemas.openxmlformats.org/markup-compatibility/2006" xmlns:wp14="http://schemas.microsoft.com/office/word/2010/wordprocessingDrawing" xmlns:w14="http://schemas.microsoft.com/office/word/2010/wordml" xmlns:w15="http://schemas.microsoft.com/office/word/2012/wordml" mc:Ignorable="w14 wp14 w15">
+  <w:p>
+    <w:pPr>
+      <w:pStyle w:val="Footer"/>
+      <w:rPr/>
+    </w:pPr>
+    <w:r>
+      <w:rPr/>
+    </w:r>
+  </w:p>
+</w:ftr>
+</file>
+
+<file path=word/footer2.xml><?xml version="1.0" encoding="utf-8"?>
+<w:ftr xmlns:o="urn:schemas-microsoft-com:office:office" xmlns:r="http://schemas.openxmlformats.org/officeDocument/2006/relationships" xmlns:v="urn:schemas-microsoft-com:vml" xmlns:w="http://schemas.openxmlformats.org/wordprocessingml/2006/main" xmlns:w10="urn:schemas-microsoft-com:office:word" xmlns:wp="http://schemas.openxmlformats.org/drawingml/2006/wordprocessingDrawing" xmlns:pic="http://schemas.openxmlformats.org/drawingml/2006/picture" xmlns:wps="http://schemas.microsoft.com/office/word/2010/wordprocessingShape" xmlns:wpg="http://schemas.microsoft.com/office/word/2010/wordprocessingGroup" xmlns:mc="http://schemas.openxmlformats.org/markup-compatibility/2006" xmlns:wp14="http://schemas.microsoft.com/office/word/2010/wordprocessingDrawing" xmlns:w14="http://schemas.microsoft.com/office/word/2010/wordml" xmlns:w15="http://schemas.microsoft.com/office/word/2012/wordml" mc:Ignorable="w14 wp14 w15">
+  <w:sdt>
+    <w:sdtPr>
+      <w:docPartObj>
+        <w:docPartGallery w:val="Page Numbers (Bottom of Page)"/>
+        <w:docPartUnique w:val="true"/>
+      </w:docPartObj>
+      <w:id w:val="425320877"/>
+    </w:sdtPr>
+    <w:sdtContent>
+      <w:p>
+        <w:pPr>
+          <w:pStyle w:val="Footer"/>
+          <w:jc w:val="center"/>
+          <w:rPr/>
+        </w:pPr>
+        <w:r>
+          <w:rPr/>
+          <w:fldChar w:fldCharType="begin"/>
+        </w:r>
+        <w:r>
+          <w:rPr/>
+          <w:instrText xml:space="preserve"> PAGE </w:instrText>
+        </w:r>
+        <w:r>
+          <w:rPr/>
+          <w:fldChar w:fldCharType="separate"/>
+        </w:r>
+        <w:r>
+          <w:rPr/>
+          <w:t>13</w:t>
+        </w:r>
+        <w:r>
+          <w:rPr/>
+          <w:fldChar w:fldCharType="end"/>
+        </w:r>
+      </w:p>
+    </w:sdtContent>
+  </w:sdt>
+  <w:p>
+    <w:pPr>
+      <w:pStyle w:val="Footer"/>
+      <w:rPr/>
+    </w:pPr>
+    <w:r>
+      <w:rPr/>
+    </w:r>
+  </w:p>
+</w:ftr>
+</file>
+
+<file path=word/footer3.xml><?xml version="1.0" encoding="utf-8"?>
+<w:ftr xmlns:o="urn:schemas-microsoft-com:office:office" xmlns:r="http://schemas.openxmlformats.org/officeDocument/2006/relationships" xmlns:v="urn:schemas-microsoft-com:vml" xmlns:w="http://schemas.openxmlformats.org/wordprocessingml/2006/main" xmlns:w10="urn:schemas-microsoft-com:office:word" xmlns:wp="http://schemas.openxmlformats.org/drawingml/2006/wordprocessingDrawing" xmlns:pic="http://schemas.openxmlformats.org/drawingml/2006/picture" xmlns:wps="http://schemas.microsoft.com/office/word/2010/wordprocessingShape" xmlns:wpg="http://schemas.microsoft.com/office/word/2010/wordprocessingGroup" xmlns:mc="http://schemas.openxmlformats.org/markup-compatibility/2006" xmlns:wp14="http://schemas.microsoft.com/office/word/2010/wordprocessingDrawing" xmlns:w14="http://schemas.microsoft.com/office/word/2010/wordml" xmlns:w15="http://schemas.microsoft.com/office/word/2012/wordml" mc:Ignorable="w14 wp14 w15">
   <w:sdt>
     <w:sdtPr>
       <w:docPartObj>
@@ -9870,7 +9989,7 @@
     </w:rPr>
   </w:style>
   <w:style w:type="paragraph" w:styleId="Heading1">
-    <w:name w:val="Heading 1"/>
+    <w:name w:val="heading 1"/>
     <w:basedOn w:val="Normal"/>
     <w:next w:val="Normal"/>
     <w:link w:val="1Char"/>
@@ -9892,7 +10011,7 @@
     </w:rPr>
   </w:style>
   <w:style w:type="paragraph" w:styleId="Heading2">
-    <w:name w:val="Heading 2"/>
+    <w:name w:val="heading 2"/>
     <w:basedOn w:val="Normal"/>
     <w:next w:val="Normal"/>
     <w:link w:val="2Char"/>
@@ -9909,7 +10028,7 @@
     </w:rPr>
   </w:style>
   <w:style w:type="paragraph" w:styleId="Heading3">
-    <w:name w:val="Heading 3"/>
+    <w:name w:val="heading 3"/>
     <w:basedOn w:val="Normal"/>
     <w:next w:val="Normal"/>
     <w:link w:val="3Char"/>
@@ -9919,7 +10038,7 @@
     <w:rsid w:val="00756820"/>
     <w:pPr>
       <w:keepNext w:val="true"/>
-      <w:ind w:left="300" w:hanging="2000"/>
+      <w:ind w:hanging="2000" w:left="300"/>
       <w:outlineLvl w:val="2"/>
     </w:pPr>
     <w:rPr>
@@ -9927,7 +10046,7 @@
     </w:rPr>
   </w:style>
   <w:style w:type="paragraph" w:styleId="Heading4">
-    <w:name w:val="Heading 4"/>
+    <w:name w:val="heading 4"/>
     <w:basedOn w:val="Normal"/>
     <w:next w:val="Normal"/>
     <w:link w:val="4Char"/>
@@ -9937,7 +10056,7 @@
     <w:rsid w:val="00bb6294"/>
     <w:pPr>
       <w:keepNext w:val="true"/>
-      <w:ind w:left="400" w:hanging="2000"/>
+      <w:ind w:hanging="2000" w:left="400"/>
       <w:outlineLvl w:val="3"/>
     </w:pPr>
     <w:rPr>
@@ -9997,14 +10116,14 @@
       <w:rFonts w:ascii="맑은 고딕" w:hAnsi="맑은 고딕" w:eastAsia="맑은 고딕" w:cs="" w:asciiTheme="majorHAnsi" w:cstheme="majorBidi" w:eastAsiaTheme="majorEastAsia" w:hAnsiTheme="majorHAnsi"/>
     </w:rPr>
   </w:style>
-  <w:style w:type="character" w:styleId="InternetLink">
+  <w:style w:type="character" w:styleId="Hyperlink">
     <w:name w:val="Hyperlink"/>
     <w:basedOn w:val="DefaultParagraphFont"/>
     <w:uiPriority w:val="99"/>
     <w:unhideWhenUsed/>
     <w:rsid w:val="00756820"/>
     <w:rPr>
-      <w:color w:val="0000FF" w:themeColor="hyperlink"/>
+      <w:color w:themeColor="hyperlink" w:val="0000FF"/>
       <w:u w:val="single"/>
     </w:rPr>
   </w:style>
@@ -10067,7 +10186,7 @@
       <w:szCs w:val="24"/>
     </w:rPr>
   </w:style>
-  <w:style w:type="character" w:styleId="Token" w:customStyle="1">
+  <w:style w:type="character" w:styleId="token" w:customStyle="1">
     <w:name w:val="token"/>
     <w:basedOn w:val="DefaultParagraphFont"/>
     <w:qFormat/>
@@ -10088,14 +10207,14 @@
       <w:szCs w:val="24"/>
     </w:rPr>
   </w:style>
-  <w:style w:type="character" w:styleId="Hljsstring" w:customStyle="1">
+  <w:style w:type="character" w:styleId="hljs-string" w:customStyle="1">
     <w:name w:val="hljs-string"/>
     <w:basedOn w:val="DefaultParagraphFont"/>
     <w:qFormat/>
     <w:rsid w:val="00500a1d"/>
     <w:rPr/>
   </w:style>
-  <w:style w:type="character" w:styleId="Hljsattr" w:customStyle="1">
+  <w:style w:type="character" w:styleId="hljs-attr" w:customStyle="1">
     <w:name w:val="hljs-attr"/>
     <w:basedOn w:val="DefaultParagraphFont"/>
     <w:qFormat/>
@@ -10115,7 +10234,7 @@
   <w:style w:type="paragraph" w:styleId="Heading">
     <w:name w:val="Heading"/>
     <w:basedOn w:val="Normal"/>
-    <w:next w:val="TextBody"/>
+    <w:next w:val="BodyText"/>
     <w:qFormat/>
     <w:pPr>
       <w:keepNext w:val="true"/>
@@ -10127,7 +10246,7 @@
       <w:szCs w:val="28"/>
     </w:rPr>
   </w:style>
-  <w:style w:type="paragraph" w:styleId="TextBody">
+  <w:style w:type="paragraph" w:styleId="BodyText">
     <w:name w:val="Body Text"/>
     <w:basedOn w:val="Normal"/>
     <w:pPr>
@@ -10137,26 +10256,24 @@
   </w:style>
   <w:style w:type="paragraph" w:styleId="List">
     <w:name w:val="List"/>
-    <w:basedOn w:val="TextBody"/>
+    <w:basedOn w:val="BodyText"/>
     <w:pPr/>
     <w:rPr>
       <w:rFonts w:cs="Lohit Devanagari"/>
     </w:rPr>
   </w:style>
   <w:style w:type="paragraph" w:styleId="Caption">
-    <w:name w:val="Caption"/>
+    <w:name w:val="caption"/>
     <w:basedOn w:val="Normal"/>
+    <w:next w:val="Normal"/>
+    <w:unhideWhenUsed/>
     <w:qFormat/>
-    <w:pPr>
-      <w:suppressLineNumbers/>
-      <w:spacing w:before="120" w:after="120"/>
-    </w:pPr>
+    <w:rsid w:val="00f55610"/>
+    <w:pPr/>
     <w:rPr>
-      <w:rFonts w:cs="Lohit Devanagari"/>
-      <w:i/>
-      <w:iCs/>
-      <w:sz w:val="24"/>
-      <w:szCs w:val="24"/>
+      <w:b/>
+      <w:bCs/>
+      <w:szCs w:val="20"/>
     </w:rPr>
   </w:style>
   <w:style w:type="paragraph" w:styleId="Index">
@@ -10177,7 +10294,7 @@
     <w:qFormat/>
     <w:rsid w:val="00756820"/>
     <w:pPr>
-      <w:ind w:left="800" w:hanging="0"/>
+      <w:ind w:hanging="0" w:left="800"/>
     </w:pPr>
     <w:rPr/>
   </w:style>
@@ -10195,12 +10312,12 @@
     <w:rPr/>
   </w:style>
   <w:style w:type="paragraph" w:styleId="IndexHeading">
-    <w:name w:val="Index Heading"/>
+    <w:name w:val="index heading"/>
     <w:basedOn w:val="Heading"/>
     <w:pPr/>
     <w:rPr/>
   </w:style>
-  <w:style w:type="paragraph" w:styleId="ContentsHeading">
+  <w:style w:type="paragraph" w:styleId="TOCHeading">
     <w:name w:val="TOC Heading"/>
     <w:basedOn w:val="Heading1"/>
     <w:next w:val="Normal"/>
@@ -10220,12 +10337,12 @@
     <w:rPr>
       <w:b/>
       <w:bCs/>
-      <w:color w:val="365F91" w:themeColor="accent1" w:themeShade="bf"/>
+      <w:color w:themeColor="accent1" w:themeShade="bf" w:val="365F91"/>
       <w:kern w:val="0"/>
     </w:rPr>
   </w:style>
-  <w:style w:type="paragraph" w:styleId="Contents1">
-    <w:name w:val="TOC 1"/>
+  <w:style w:type="paragraph" w:styleId="TOC1">
+    <w:name w:val="toc 1"/>
     <w:basedOn w:val="Normal"/>
     <w:next w:val="Normal"/>
     <w:autoRedefine/>
@@ -10235,8 +10352,8 @@
     <w:pPr/>
     <w:rPr/>
   </w:style>
-  <w:style w:type="paragraph" w:styleId="Contents2">
-    <w:name w:val="TOC 2"/>
+  <w:style w:type="paragraph" w:styleId="TOC2">
+    <w:name w:val="toc 2"/>
     <w:basedOn w:val="Normal"/>
     <w:next w:val="Normal"/>
     <w:autoRedefine/>
@@ -10244,12 +10361,12 @@
     <w:unhideWhenUsed/>
     <w:rsid w:val="00756820"/>
     <w:pPr>
-      <w:ind w:left="425" w:hanging="0"/>
+      <w:ind w:hanging="0" w:left="425"/>
     </w:pPr>
     <w:rPr/>
   </w:style>
-  <w:style w:type="paragraph" w:styleId="Contents3">
-    <w:name w:val="TOC 3"/>
+  <w:style w:type="paragraph" w:styleId="TOC3">
+    <w:name w:val="toc 3"/>
     <w:basedOn w:val="Normal"/>
     <w:next w:val="Normal"/>
     <w:autoRedefine/>
@@ -10257,7 +10374,7 @@
     <w:unhideWhenUsed/>
     <w:rsid w:val="00756820"/>
     <w:pPr>
-      <w:ind w:left="850" w:hanging="0"/>
+      <w:ind w:hanging="0" w:left="850"/>
     </w:pPr>
     <w:rPr/>
   </w:style>
@@ -10285,7 +10402,7 @@
     <w:rPr/>
   </w:style>
   <w:style w:type="paragraph" w:styleId="Header">
-    <w:name w:val="Header"/>
+    <w:name w:val="header"/>
     <w:basedOn w:val="Normal"/>
     <w:link w:val="Char2"/>
     <w:uiPriority w:val="99"/>
@@ -10303,7 +10420,7 @@
     <w:rPr/>
   </w:style>
   <w:style w:type="paragraph" w:styleId="Footer">
-    <w:name w:val="Footer"/>
+    <w:name w:val="footer"/>
     <w:basedOn w:val="Normal"/>
     <w:link w:val="Char3"/>
     <w:uiPriority w:val="99"/>
@@ -10332,7 +10449,7 @@
       </w:numPr>
       <w:snapToGrid w:val="false"/>
       <w:spacing w:lineRule="auto" w:line="300" w:before="120" w:after="120"/>
-      <w:ind w:right="136" w:hanging="0"/>
+      <w:ind w:hanging="0" w:right="136"/>
       <w:jc w:val="both"/>
       <w:textAlignment w:val="baseline"/>
     </w:pPr>
@@ -10341,21 +10458,7 @@
       <w:szCs w:val="20"/>
     </w:rPr>
   </w:style>
-  <w:style w:type="paragraph" w:styleId="Caption1">
-    <w:name w:val="caption"/>
-    <w:basedOn w:val="Normal"/>
-    <w:next w:val="Normal"/>
-    <w:unhideWhenUsed/>
-    <w:qFormat/>
-    <w:rsid w:val="00f55610"/>
-    <w:pPr/>
-    <w:rPr>
-      <w:b/>
-      <w:bCs/>
-      <w:szCs w:val="20"/>
-    </w:rPr>
-  </w:style>
-  <w:style w:type="paragraph" w:styleId="Tableoffigures">
+  <w:style w:type="paragraph" w:styleId="TableofFigures">
     <w:name w:val="table of figures"/>
     <w:basedOn w:val="Normal"/>
     <w:next w:val="Normal"/>
@@ -10364,7 +10467,7 @@
     <w:qFormat/>
     <w:rsid w:val="00f55610"/>
     <w:pPr>
-      <w:ind w:left="400" w:hanging="200"/>
+      <w:ind w:hanging="200" w:left="400"/>
     </w:pPr>
     <w:rPr/>
   </w:style>
@@ -10440,10 +10543,53 @@
       <w:szCs w:val="24"/>
     </w:rPr>
   </w:style>
+  <w:style w:type="paragraph" w:styleId="FrameContentsuser">
+    <w:name w:val="Frame Contents (user)"/>
+    <w:basedOn w:val="Normal"/>
+    <w:qFormat/>
+    <w:pPr/>
+    <w:rPr/>
+  </w:style>
   <w:style w:type="paragraph" w:styleId="FrameContents">
     <w:name w:val="Frame Contents"/>
     <w:basedOn w:val="Normal"/>
     <w:qFormat/>
+    <w:pPr/>
+    <w:rPr/>
+  </w:style>
+  <w:style w:type="paragraph" w:styleId="TOC4">
+    <w:name w:val="toc 4"/>
+    <w:basedOn w:val="Index"/>
+    <w:pPr/>
+    <w:rPr/>
+  </w:style>
+  <w:style w:type="paragraph" w:styleId="TOC5">
+    <w:name w:val="toc 5"/>
+    <w:basedOn w:val="Index"/>
+    <w:pPr/>
+    <w:rPr/>
+  </w:style>
+  <w:style w:type="paragraph" w:styleId="TOC6">
+    <w:name w:val="toc 6"/>
+    <w:basedOn w:val="Index"/>
+    <w:pPr/>
+    <w:rPr/>
+  </w:style>
+  <w:style w:type="paragraph" w:styleId="TOC7">
+    <w:name w:val="toc 7"/>
+    <w:basedOn w:val="Index"/>
+    <w:pPr/>
+    <w:rPr/>
+  </w:style>
+  <w:style w:type="paragraph" w:styleId="TOC8">
+    <w:name w:val="toc 8"/>
+    <w:basedOn w:val="Index"/>
+    <w:pPr/>
+    <w:rPr/>
+  </w:style>
+  <w:style w:type="paragraph" w:styleId="TOC9">
+    <w:name w:val="toc 9"/>
+    <w:basedOn w:val="Index"/>
     <w:pPr/>
     <w:rPr/>
   </w:style>
@@ -10498,41 +10644,41 @@
 </file>
 
 <file path=word/theme/theme1.xml><?xml version="1.0" encoding="utf-8"?>
-<a:theme xmlns:a="http://schemas.openxmlformats.org/drawingml/2006/main" name="Office 테마">
+<a:theme xmlns:a="http://schemas.openxmlformats.org/drawingml/2006/main" xmlns:r="http://schemas.openxmlformats.org/officeDocument/2006/relationships" name="Office 테마">
   <a:themeElements>
     <a:clrScheme name="Office">
       <a:dk1>
-        <a:sysClr val="windowText" lastClr="000000"/>
+        <a:srgbClr val="000000"/>
       </a:dk1>
       <a:lt1>
-        <a:sysClr val="window" lastClr="FFFFFF"/>
+        <a:srgbClr val="ffffff"/>
       </a:lt1>
       <a:dk2>
-        <a:srgbClr val="1F497D"/>
+        <a:srgbClr val="1f497d"/>
       </a:dk2>
       <a:lt2>
-        <a:srgbClr val="EEECE1"/>
+        <a:srgbClr val="eeece1"/>
       </a:lt2>
       <a:accent1>
-        <a:srgbClr val="4F81BD"/>
+        <a:srgbClr val="4f81bd"/>
       </a:accent1>
       <a:accent2>
-        <a:srgbClr val="C0504D"/>
+        <a:srgbClr val="c0504d"/>
       </a:accent2>
       <a:accent3>
-        <a:srgbClr val="9BBB59"/>
+        <a:srgbClr val="9bbb59"/>
       </a:accent3>
       <a:accent4>
-        <a:srgbClr val="8064A2"/>
+        <a:srgbClr val="8064a2"/>
       </a:accent4>
       <a:accent5>
-        <a:srgbClr val="4BACC6"/>
+        <a:srgbClr val="4bacc6"/>
       </a:accent5>
       <a:accent6>
-        <a:srgbClr val="F79646"/>
+        <a:srgbClr val="f79646"/>
       </a:accent6>
       <a:hlink>
-        <a:srgbClr val="0000FF"/>
+        <a:srgbClr val="0000ff"/>
       </a:hlink>
       <a:folHlink>
         <a:srgbClr val="800080"/>
@@ -10540,243 +10686,135 @@
     </a:clrScheme>
     <a:fontScheme name="Office">
       <a:majorFont>
-        <a:latin typeface="맑은 고딕"/>
+        <a:latin typeface="맑은 고딕" pitchFamily="0" charset="1"/>
         <a:ea typeface=""/>
         <a:cs typeface=""/>
-        <a:font script="Jpan" typeface="ＭＳ ゴシック"/>
-        <a:font script="Hang" typeface="맑은 고딕"/>
-        <a:font script="Hans" typeface="宋体"/>
-        <a:font script="Hant" typeface="新細明體"/>
-        <a:font script="Arab" typeface="Times New Roman"/>
-        <a:font script="Hebr" typeface="Times New Roman"/>
-        <a:font script="Thai" typeface="Angsana New"/>
-        <a:font script="Ethi" typeface="Nyala"/>
-        <a:font script="Beng" typeface="Vrinda"/>
-        <a:font script="Gujr" typeface="Shruti"/>
-        <a:font script="Khmr" typeface="MoolBoran"/>
-        <a:font script="Knda" typeface="Tunga"/>
-        <a:font script="Guru" typeface="Raavi"/>
-        <a:font script="Cans" typeface="Euphemia"/>
-        <a:font script="Cher" typeface="Plantagenet Cherokee"/>
-        <a:font script="Yiii" typeface="Microsoft Yi Baiti"/>
-        <a:font script="Tibt" typeface="Microsoft Himalaya"/>
-        <a:font script="Thaa" typeface="MV Boli"/>
-        <a:font script="Deva" typeface="Mangal"/>
-        <a:font script="Telu" typeface="Gautami"/>
-        <a:font script="Taml" typeface="Latha"/>
-        <a:font script="Syrc" typeface="Estrangelo Edessa"/>
-        <a:font script="Orya" typeface="Kalinga"/>
-        <a:font script="Mlym" typeface="Kartika"/>
-        <a:font script="Laoo" typeface="DokChampa"/>
-        <a:font script="Sinh" typeface="Iskoola Pota"/>
-        <a:font script="Mong" typeface="Mongolian Baiti"/>
-        <a:font script="Viet" typeface="Times New Roman"/>
-        <a:font script="Uigh" typeface="Microsoft Uighur"/>
       </a:majorFont>
       <a:minorFont>
-        <a:latin typeface="맑은 고딕"/>
+        <a:latin typeface="맑은 고딕" pitchFamily="0" charset="1"/>
         <a:ea typeface=""/>
         <a:cs typeface=""/>
-        <a:font script="Jpan" typeface="ＭＳ 明朝"/>
-        <a:font script="Hang" typeface="맑은 고딕"/>
-        <a:font script="Hans" typeface="宋体"/>
-        <a:font script="Hant" typeface="新細明體"/>
-        <a:font script="Arab" typeface="Arial"/>
-        <a:font script="Hebr" typeface="Arial"/>
-        <a:font script="Thai" typeface="Cordia New"/>
-        <a:font script="Ethi" typeface="Nyala"/>
-        <a:font script="Beng" typeface="Vrinda"/>
-        <a:font script="Gujr" typeface="Shruti"/>
-        <a:font script="Khmr" typeface="DaunPenh"/>
-        <a:font script="Knda" typeface="Tunga"/>
-        <a:font script="Guru" typeface="Raavi"/>
-        <a:font script="Cans" typeface="Euphemia"/>
-        <a:font script="Cher" typeface="Plantagenet Cherokee"/>
-        <a:font script="Yiii" typeface="Microsoft Yi Baiti"/>
-        <a:font script="Tibt" typeface="Microsoft Himalaya"/>
-        <a:font script="Thaa" typeface="MV Boli"/>
-        <a:font script="Deva" typeface="Mangal"/>
-        <a:font script="Telu" typeface="Gautami"/>
-        <a:font script="Taml" typeface="Latha"/>
-        <a:font script="Syrc" typeface="Estrangelo Edessa"/>
-        <a:font script="Orya" typeface="Kalinga"/>
-        <a:font script="Mlym" typeface="Kartika"/>
-        <a:font script="Laoo" typeface="DokChampa"/>
-        <a:font script="Sinh" typeface="Iskoola Pota"/>
-        <a:font script="Mong" typeface="Mongolian Baiti"/>
-        <a:font script="Viet" typeface="Arial"/>
-        <a:font script="Uigh" typeface="Microsoft Uighur"/>
       </a:minorFont>
     </a:fontScheme>
-    <a:fmtScheme name="Office">
+    <a:fmtScheme>
       <a:fillStyleLst>
         <a:solidFill>
           <a:schemeClr val="phClr"/>
         </a:solidFill>
-        <a:gradFill rotWithShape="1">
+        <a:gradFill>
           <a:gsLst>
             <a:gs pos="0">
               <a:schemeClr val="phClr">
                 <a:tint val="50000"/>
-                <a:satMod val="300000"/>
               </a:schemeClr>
             </a:gs>
             <a:gs pos="35000">
               <a:schemeClr val="phClr">
                 <a:tint val="37000"/>
-                <a:satMod val="300000"/>
               </a:schemeClr>
             </a:gs>
             <a:gs pos="100000">
               <a:schemeClr val="phClr">
                 <a:tint val="15000"/>
-                <a:satMod val="350000"/>
               </a:schemeClr>
             </a:gs>
           </a:gsLst>
           <a:lin ang="16200000" scaled="1"/>
+          <a:tileRect l="0" t="0" r="0" b="0"/>
         </a:gradFill>
-        <a:gradFill rotWithShape="1">
+        <a:gradFill>
           <a:gsLst>
             <a:gs pos="0">
               <a:schemeClr val="phClr">
                 <a:shade val="51000"/>
-                <a:satMod val="130000"/>
               </a:schemeClr>
             </a:gs>
             <a:gs pos="80000">
               <a:schemeClr val="phClr">
                 <a:shade val="93000"/>
-                <a:satMod val="130000"/>
               </a:schemeClr>
             </a:gs>
             <a:gs pos="100000">
               <a:schemeClr val="phClr">
                 <a:shade val="94000"/>
-                <a:satMod val="135000"/>
               </a:schemeClr>
             </a:gs>
           </a:gsLst>
           <a:lin ang="16200000" scaled="0"/>
+          <a:tileRect l="0" t="0" r="0" b="0"/>
         </a:gradFill>
       </a:fillStyleLst>
       <a:lnStyleLst>
         <a:ln w="9525" cap="flat" cmpd="sng" algn="ctr">
-          <a:solidFill>
-            <a:schemeClr val="phClr">
-              <a:shade val="95000"/>
-              <a:satMod val="105000"/>
-            </a:schemeClr>
-          </a:solidFill>
           <a:prstDash val="solid"/>
         </a:ln>
         <a:ln w="25400" cap="flat" cmpd="sng" algn="ctr">
-          <a:solidFill>
-            <a:schemeClr val="phClr"/>
-          </a:solidFill>
           <a:prstDash val="solid"/>
         </a:ln>
         <a:ln w="38100" cap="flat" cmpd="sng" algn="ctr">
-          <a:solidFill>
-            <a:schemeClr val="phClr"/>
-          </a:solidFill>
           <a:prstDash val="solid"/>
         </a:ln>
       </a:lnStyleLst>
       <a:effectStyleLst>
         <a:effectStyle>
-          <a:effectLst>
-            <a:outerShdw blurRad="40000" dist="20000" dir="5400000" rotWithShape="0">
-              <a:srgbClr val="000000">
-                <a:alpha val="38000"/>
-              </a:srgbClr>
-            </a:outerShdw>
-          </a:effectLst>
+          <a:effectLst/>
         </a:effectStyle>
         <a:effectStyle>
-          <a:effectLst>
-            <a:outerShdw blurRad="40000" dist="23000" dir="5400000" rotWithShape="0">
-              <a:srgbClr val="000000">
-                <a:alpha val="35000"/>
-              </a:srgbClr>
-            </a:outerShdw>
-          </a:effectLst>
+          <a:effectLst/>
         </a:effectStyle>
         <a:effectStyle>
-          <a:effectLst>
-            <a:outerShdw blurRad="40000" dist="23000" dir="5400000" rotWithShape="0">
-              <a:srgbClr val="000000">
-                <a:alpha val="35000"/>
-              </a:srgbClr>
-            </a:outerShdw>
-          </a:effectLst>
-          <a:scene3d>
-            <a:camera prst="orthographicFront">
-              <a:rot lat="0" lon="0" rev="0"/>
-            </a:camera>
-            <a:lightRig rig="threePt" dir="t">
-              <a:rot lat="0" lon="0" rev="1200000"/>
-            </a:lightRig>
-          </a:scene3d>
-          <a:sp3d>
-            <a:bevelT w="63500" h="25400"/>
-          </a:sp3d>
+          <a:effectLst/>
         </a:effectStyle>
       </a:effectStyleLst>
       <a:bgFillStyleLst>
         <a:solidFill>
           <a:schemeClr val="phClr"/>
         </a:solidFill>
-        <a:gradFill rotWithShape="1">
+        <a:gradFill>
           <a:gsLst>
             <a:gs pos="0">
               <a:schemeClr val="phClr">
                 <a:tint val="40000"/>
-                <a:satMod val="350000"/>
               </a:schemeClr>
             </a:gs>
             <a:gs pos="40000">
               <a:schemeClr val="phClr">
                 <a:tint val="45000"/>
                 <a:shade val="99000"/>
-                <a:satMod val="350000"/>
               </a:schemeClr>
             </a:gs>
             <a:gs pos="100000">
               <a:schemeClr val="phClr">
                 <a:shade val="20000"/>
-                <a:satMod val="255000"/>
               </a:schemeClr>
             </a:gs>
           </a:gsLst>
           <a:path path="circle">
             <a:fillToRect l="50000" t="-80000" r="50000" b="180000"/>
           </a:path>
+          <a:tileRect l="0" t="0" r="0" b="0"/>
         </a:gradFill>
-        <a:gradFill rotWithShape="1">
+        <a:gradFill>
           <a:gsLst>
             <a:gs pos="0">
               <a:schemeClr val="phClr">
                 <a:tint val="80000"/>
-                <a:satMod val="300000"/>
               </a:schemeClr>
             </a:gs>
             <a:gs pos="100000">
               <a:schemeClr val="phClr">
                 <a:shade val="30000"/>
-                <a:satMod val="200000"/>
               </a:schemeClr>
             </a:gs>
           </a:gsLst>
           <a:path path="circle">
             <a:fillToRect l="50000" t="50000" r="50000" b="50000"/>
           </a:path>
+          <a:tileRect l="0" t="0" r="0" b="0"/>
         </a:gradFill>
       </a:bgFillStyleLst>
     </a:fmtScheme>
   </a:themeElements>
-  <a:objectDefaults/>
-  <a:extraClrSchemeLst/>
 </a:theme>
 </file>
 

</xml_diff>